<commit_message>
User manual: revision history reduced to 001 Initial document
Co-Authored-By: Claude Sonnet 5.5 <noreply@anthropic.com>
Claude-Session: https://claude.ai/code/session_014FSgcx4We9RLg8PGCKePg8
</commit_message>
<xml_diff>
--- a/docs/CORP-P2-ENG-0164-Fleet IDS SIEM - User Manual.docx
+++ b/docs/CORP-P2-ENG-0164-Fleet IDS SIEM - User Manual.docx
@@ -8844,7 +8844,7 @@
               <w:rPr>
                 <w:lang w:val="en-GB"/>
               </w:rPr>
-              <w:t xml:space="preserve">Creation of document</w:t>
+              <w:t xml:space="preserve">Initial document</w:t>
             </w:r>
           </w:p>
         </w:tc>
@@ -8870,7 +8870,7 @@
               <w:rPr>
                 <w:lang w:val="en-GB"/>
               </w:rPr>
-              <w:t xml:space="preserve">M. Wachs</w:t>
+              <w:t xml:space="preserve">Matthias Wachs</w:t>
             </w:r>
           </w:p>
         </w:tc>
@@ -8890,426 +8890,6 @@
               <w:spacing w:line="276" w:lineRule="auto"/>
               <w:rPr>
                 <w:lang w:val="de-DE"/>
-              </w:rPr>
-            </w:pPr>
-            <w:r>
-              <w:rPr>
-                <w:lang w:val="en-GB"/>
-              </w:rPr>
-              <w:t xml:space="preserve">14.10.2026</w:t>
-            </w:r>
-          </w:p>
-        </w:tc>
-      </w:tr>
-      <w:tr>
-        <w:trPr>
-          <w:trHeight w:val="300"/>
-        </w:trPr>
-        <w:tc>
-          <w:tcPr>
-            <w:tcW w:w="920" w:type="dxa"/>
-            <w:tcBorders>
-              <w:top w:val="single" w:sz="6" w:space="0" w:color="auto"/>
-              <w:left w:val="single" w:sz="6" w:space="0" w:color="auto"/>
-              <w:bottom w:val="single" w:sz="6" w:space="0" w:color="auto"/>
-              <w:right w:val="single" w:sz="6" w:space="0" w:color="auto"/>
-            </w:tcBorders>
-          </w:tcPr>
-          <w:p>
-            <w:pPr>
-              <w:spacing w:line="276" w:lineRule="auto"/>
-              <w:rPr>
-                <w:lang w:val="en-GB"/>
-              </w:rPr>
-            </w:pPr>
-            <w:r>
-              <w:rPr>
-                <w:lang w:val="en-GB"/>
-              </w:rPr>
-              <w:t xml:space="preserve">002</w:t>
-            </w:r>
-          </w:p>
-        </w:tc>
-        <w:tc>
-          <w:tcPr>
-            <w:tcW w:w="5885" w:type="dxa"/>
-            <w:tcBorders>
-              <w:top w:val="single" w:sz="6" w:space="0" w:color="auto"/>
-              <w:left w:val="single" w:sz="6" w:space="0" w:color="auto"/>
-              <w:bottom w:val="single" w:sz="6" w:space="0" w:color="auto"/>
-              <w:right w:val="single" w:sz="6" w:space="0" w:color="auto"/>
-            </w:tcBorders>
-          </w:tcPr>
-          <w:p>
-            <w:pPr>
-              <w:spacing w:line="276" w:lineRule="auto"/>
-              <w:rPr>
-                <w:lang w:val="en-GB"/>
-              </w:rPr>
-            </w:pPr>
-            <w:r>
-              <w:rPr>
-                <w:lang w:val="en-GB"/>
-              </w:rPr>
-              <w:t xml:space="preserve">Added suppression rules, case report export and phone layout</w:t>
-            </w:r>
-          </w:p>
-        </w:tc>
-        <w:tc>
-          <w:tcPr>
-            <w:tcW w:w="2268" w:type="dxa"/>
-            <w:tcBorders>
-              <w:top w:val="single" w:sz="6" w:space="0" w:color="auto"/>
-              <w:left w:val="single" w:sz="6" w:space="0" w:color="auto"/>
-              <w:bottom w:val="single" w:sz="6" w:space="0" w:color="auto"/>
-              <w:right w:val="single" w:sz="6" w:space="0" w:color="auto"/>
-            </w:tcBorders>
-          </w:tcPr>
-          <w:p>
-            <w:pPr>
-              <w:spacing w:line="276" w:lineRule="auto"/>
-              <w:rPr>
-                <w:lang w:val="en-GB"/>
-              </w:rPr>
-            </w:pPr>
-            <w:r>
-              <w:rPr>
-                <w:lang w:val="en-GB"/>
-              </w:rPr>
-              <w:t xml:space="preserve">M. Wachs</w:t>
-            </w:r>
-          </w:p>
-        </w:tc>
-        <w:tc>
-          <w:tcPr>
-            <w:tcW w:w="1134" w:type="dxa"/>
-            <w:tcBorders>
-              <w:top w:val="single" w:sz="6" w:space="0" w:color="auto"/>
-              <w:left w:val="single" w:sz="6" w:space="0" w:color="auto"/>
-              <w:bottom w:val="single" w:sz="6" w:space="0" w:color="auto"/>
-              <w:right w:val="single" w:sz="6" w:space="0" w:color="auto"/>
-            </w:tcBorders>
-          </w:tcPr>
-          <w:p>
-            <w:pPr>
-              <w:spacing w:line="276" w:lineRule="auto"/>
-              <w:rPr>
-                <w:lang w:val="en-GB"/>
-              </w:rPr>
-            </w:pPr>
-            <w:r>
-              <w:rPr>
-                <w:lang w:val="en-GB"/>
-              </w:rPr>
-              <w:t xml:space="preserve">14.10.2026</w:t>
-            </w:r>
-          </w:p>
-        </w:tc>
-      </w:tr>
-      <w:tr>
-        <w:trPr>
-          <w:trHeight w:val="300"/>
-        </w:trPr>
-        <w:tc>
-          <w:tcPr>
-            <w:tcW w:w="920" w:type="dxa"/>
-            <w:tcBorders>
-              <w:top w:val="single" w:sz="6" w:space="0" w:color="auto"/>
-              <w:left w:val="single" w:sz="6" w:space="0" w:color="auto"/>
-              <w:bottom w:val="single" w:sz="6" w:space="0" w:color="auto"/>
-              <w:right w:val="single" w:sz="6" w:space="0" w:color="auto"/>
-            </w:tcBorders>
-          </w:tcPr>
-          <w:p>
-            <w:pPr>
-              <w:spacing w:line="276" w:lineRule="auto"/>
-              <w:rPr>
-                <w:lang w:val="en-GB"/>
-              </w:rPr>
-            </w:pPr>
-            <w:r>
-              <w:rPr>
-                <w:lang w:val="en-GB"/>
-              </w:rPr>
-              <w:t xml:space="preserve">003</w:t>
-            </w:r>
-          </w:p>
-        </w:tc>
-        <w:tc>
-          <w:tcPr>
-            <w:tcW w:w="5885" w:type="dxa"/>
-            <w:tcBorders>
-              <w:top w:val="single" w:sz="6" w:space="0" w:color="auto"/>
-              <w:left w:val="single" w:sz="6" w:space="0" w:color="auto"/>
-              <w:bottom w:val="single" w:sz="6" w:space="0" w:color="auto"/>
-              <w:right w:val="single" w:sz="6" w:space="0" w:color="auto"/>
-            </w:tcBorders>
-          </w:tcPr>
-          <w:p>
-            <w:pPr>
-              <w:spacing w:line="276" w:lineRule="auto"/>
-              <w:rPr>
-                <w:lang w:val="en-GB"/>
-              </w:rPr>
-            </w:pPr>
-            <w:r>
-              <w:rPr>
-                <w:lang w:val="en-GB"/>
-              </w:rPr>
-              <w:t xml:space="preserve">Added two-step sign-in (authenticator app, passkeys, recovery codes)</w:t>
-            </w:r>
-          </w:p>
-        </w:tc>
-        <w:tc>
-          <w:tcPr>
-            <w:tcW w:w="2268" w:type="dxa"/>
-            <w:tcBorders>
-              <w:top w:val="single" w:sz="6" w:space="0" w:color="auto"/>
-              <w:left w:val="single" w:sz="6" w:space="0" w:color="auto"/>
-              <w:bottom w:val="single" w:sz="6" w:space="0" w:color="auto"/>
-              <w:right w:val="single" w:sz="6" w:space="0" w:color="auto"/>
-            </w:tcBorders>
-          </w:tcPr>
-          <w:p>
-            <w:pPr>
-              <w:spacing w:line="276" w:lineRule="auto"/>
-              <w:rPr>
-                <w:lang w:val="en-GB"/>
-              </w:rPr>
-            </w:pPr>
-            <w:r>
-              <w:rPr>
-                <w:lang w:val="en-GB"/>
-              </w:rPr>
-              <w:t xml:space="preserve">M. Wachs</w:t>
-            </w:r>
-          </w:p>
-        </w:tc>
-        <w:tc>
-          <w:tcPr>
-            <w:tcW w:w="1134" w:type="dxa"/>
-            <w:tcBorders>
-              <w:top w:val="single" w:sz="6" w:space="0" w:color="auto"/>
-              <w:left w:val="single" w:sz="6" w:space="0" w:color="auto"/>
-              <w:bottom w:val="single" w:sz="6" w:space="0" w:color="auto"/>
-              <w:right w:val="single" w:sz="6" w:space="0" w:color="auto"/>
-            </w:tcBorders>
-          </w:tcPr>
-          <w:p>
-            <w:pPr>
-              <w:spacing w:line="276" w:lineRule="auto"/>
-              <w:rPr>
-                <w:lang w:val="en-GB"/>
-              </w:rPr>
-            </w:pPr>
-            <w:r>
-              <w:rPr>
-                <w:lang w:val="en-GB"/>
-              </w:rPr>
-              <w:t xml:space="preserve">14.10.2026</w:t>
-            </w:r>
-          </w:p>
-        </w:tc>
-      </w:tr>
-      <w:tr>
-        <w:trPr>
-          <w:trHeight w:val="300"/>
-        </w:trPr>
-        <w:tc>
-          <w:tcPr>
-            <w:tcW w:w="920" w:type="dxa"/>
-            <w:tcBorders>
-              <w:top w:val="single" w:sz="6" w:space="0" w:color="auto"/>
-              <w:left w:val="single" w:sz="6" w:space="0" w:color="auto"/>
-              <w:bottom w:val="single" w:sz="6" w:space="0" w:color="auto"/>
-              <w:right w:val="single" w:sz="6" w:space="0" w:color="auto"/>
-            </w:tcBorders>
-          </w:tcPr>
-          <w:p>
-            <w:pPr>
-              <w:spacing w:line="276" w:lineRule="auto"/>
-              <w:rPr>
-                <w:lang w:val="en-GB"/>
-              </w:rPr>
-            </w:pPr>
-            <w:r>
-              <w:rPr>
-                <w:lang w:val="en-GB"/>
-              </w:rPr>
-              <w:t xml:space="preserve">004</w:t>
-            </w:r>
-          </w:p>
-        </w:tc>
-        <w:tc>
-          <w:tcPr>
-            <w:tcW w:w="5885" w:type="dxa"/>
-            <w:tcBorders>
-              <w:top w:val="single" w:sz="6" w:space="0" w:color="auto"/>
-              <w:left w:val="single" w:sz="6" w:space="0" w:color="auto"/>
-              <w:bottom w:val="single" w:sz="6" w:space="0" w:color="auto"/>
-              <w:right w:val="single" w:sz="6" w:space="0" w:color="auto"/>
-            </w:tcBorders>
-          </w:tcPr>
-          <w:p>
-            <w:pPr>
-              <w:spacing w:line="276" w:lineRule="auto"/>
-              <w:rPr>
-                <w:lang w:val="en-GB"/>
-              </w:rPr>
-            </w:pPr>
-            <w:r>
-              <w:rPr>
-                <w:lang w:val="en-GB"/>
-              </w:rPr>
-              <w:t xml:space="preserve">Added automatic sync schedule</w:t>
-            </w:r>
-          </w:p>
-        </w:tc>
-        <w:tc>
-          <w:tcPr>
-            <w:tcW w:w="2268" w:type="dxa"/>
-            <w:tcBorders>
-              <w:top w:val="single" w:sz="6" w:space="0" w:color="auto"/>
-              <w:left w:val="single" w:sz="6" w:space="0" w:color="auto"/>
-              <w:bottom w:val="single" w:sz="6" w:space="0" w:color="auto"/>
-              <w:right w:val="single" w:sz="6" w:space="0" w:color="auto"/>
-            </w:tcBorders>
-          </w:tcPr>
-          <w:p>
-            <w:pPr>
-              <w:spacing w:line="276" w:lineRule="auto"/>
-              <w:rPr>
-                <w:lang w:val="en-GB"/>
-              </w:rPr>
-            </w:pPr>
-            <w:r>
-              <w:rPr>
-                <w:lang w:val="en-GB"/>
-              </w:rPr>
-              <w:t xml:space="preserve">M. Wachs</w:t>
-            </w:r>
-          </w:p>
-        </w:tc>
-        <w:tc>
-          <w:tcPr>
-            <w:tcW w:w="1134" w:type="dxa"/>
-            <w:tcBorders>
-              <w:top w:val="single" w:sz="6" w:space="0" w:color="auto"/>
-              <w:left w:val="single" w:sz="6" w:space="0" w:color="auto"/>
-              <w:bottom w:val="single" w:sz="6" w:space="0" w:color="auto"/>
-              <w:right w:val="single" w:sz="6" w:space="0" w:color="auto"/>
-            </w:tcBorders>
-          </w:tcPr>
-          <w:p>
-            <w:pPr>
-              <w:spacing w:line="276" w:lineRule="auto"/>
-              <w:rPr>
-                <w:lang w:val="en-GB"/>
-              </w:rPr>
-            </w:pPr>
-            <w:r>
-              <w:rPr>
-                <w:lang w:val="en-GB"/>
-              </w:rPr>
-              <w:t xml:space="preserve">14.10.2026</w:t>
-            </w:r>
-          </w:p>
-        </w:tc>
-      </w:tr>
-      <w:tr>
-        <w:trPr>
-          <w:trHeight w:val="300"/>
-        </w:trPr>
-        <w:tc>
-          <w:tcPr>
-            <w:tcW w:w="920" w:type="dxa"/>
-            <w:tcBorders>
-              <w:top w:val="single" w:sz="6" w:space="0" w:color="auto"/>
-              <w:left w:val="single" w:sz="6" w:space="0" w:color="auto"/>
-              <w:bottom w:val="single" w:sz="6" w:space="0" w:color="auto"/>
-              <w:right w:val="single" w:sz="6" w:space="0" w:color="auto"/>
-            </w:tcBorders>
-          </w:tcPr>
-          <w:p>
-            <w:pPr>
-              <w:spacing w:line="276" w:lineRule="auto"/>
-              <w:rPr>
-                <w:lang w:val="en-GB"/>
-              </w:rPr>
-            </w:pPr>
-            <w:r>
-              <w:rPr>
-                <w:lang w:val="en-GB"/>
-              </w:rPr>
-              <w:t xml:space="preserve">005</w:t>
-            </w:r>
-          </w:p>
-        </w:tc>
-        <w:tc>
-          <w:tcPr>
-            <w:tcW w:w="5885" w:type="dxa"/>
-            <w:tcBorders>
-              <w:top w:val="single" w:sz="6" w:space="0" w:color="auto"/>
-              <w:left w:val="single" w:sz="6" w:space="0" w:color="auto"/>
-              <w:bottom w:val="single" w:sz="6" w:space="0" w:color="auto"/>
-              <w:right w:val="single" w:sz="6" w:space="0" w:color="auto"/>
-            </w:tcBorders>
-          </w:tcPr>
-          <w:p>
-            <w:pPr>
-              <w:spacing w:line="276" w:lineRule="auto"/>
-              <w:rPr>
-                <w:lang w:val="en-GB"/>
-              </w:rPr>
-            </w:pPr>
-            <w:r>
-              <w:rPr>
-                <w:lang w:val="en-GB"/>
-              </w:rPr>
-              <w:t xml:space="preserve">Added document number CORP-P2-ENG-0164. Added backend event details, alert and case coverage of events, suggested cases, step results in the case checklist and links that open in a new tab</w:t>
-            </w:r>
-          </w:p>
-        </w:tc>
-        <w:tc>
-          <w:tcPr>
-            <w:tcW w:w="2268" w:type="dxa"/>
-            <w:tcBorders>
-              <w:top w:val="single" w:sz="6" w:space="0" w:color="auto"/>
-              <w:left w:val="single" w:sz="6" w:space="0" w:color="auto"/>
-              <w:bottom w:val="single" w:sz="6" w:space="0" w:color="auto"/>
-              <w:right w:val="single" w:sz="6" w:space="0" w:color="auto"/>
-            </w:tcBorders>
-          </w:tcPr>
-          <w:p>
-            <w:pPr>
-              <w:spacing w:line="276" w:lineRule="auto"/>
-              <w:rPr>
-                <w:lang w:val="en-GB"/>
-              </w:rPr>
-            </w:pPr>
-            <w:r>
-              <w:rPr>
-                <w:lang w:val="en-GB"/>
-              </w:rPr>
-              <w:t xml:space="preserve">M. Wachs</w:t>
-            </w:r>
-          </w:p>
-        </w:tc>
-        <w:tc>
-          <w:tcPr>
-            <w:tcW w:w="1134" w:type="dxa"/>
-            <w:tcBorders>
-              <w:top w:val="single" w:sz="6" w:space="0" w:color="auto"/>
-              <w:left w:val="single" w:sz="6" w:space="0" w:color="auto"/>
-              <w:bottom w:val="single" w:sz="6" w:space="0" w:color="auto"/>
-              <w:right w:val="single" w:sz="6" w:space="0" w:color="auto"/>
-            </w:tcBorders>
-          </w:tcPr>
-          <w:p>
-            <w:pPr>
-              <w:spacing w:line="276" w:lineRule="auto"/>
-              <w:rPr>
-                <w:lang w:val="en-GB"/>
               </w:rPr>
             </w:pPr>
             <w:r>
@@ -9831,7 +9411,7 @@
         </w:tcPr>
         <w:p>
           <w:r>
-            <w:t>Revision: 005</w:t>
+            <w:t>Revision: 001</w:t>
           </w:r>
           <w:r/>
         </w:p>

</xml_diff>

<commit_message>
Rename the tool to Fleet IDS SIEM (UI, reports, 2FA issuer, docs, user manual and screenshots)
Co-Authored-By: Claude Sonnet 5.5 <noreply@anthropic.com>
Claude-Session: https://claude.ai/code/session_014FSgcx4We9RLg8PGCKePg8
</commit_message>
<xml_diff>
--- a/docs/CORP-P2-ENG-0164-Fleet IDS SIEM - User Manual.docx
+++ b/docs/CORP-P2-ENG-0164-Fleet IDS SIEM - User Manual.docx
@@ -1299,7 +1299,7 @@
         <w:rPr>
           <w:b/>
         </w:rPr>
-        <w:t xml:space="preserve">Fleet IDS</w:t>
+        <w:t xml:space="preserve">Fleet IDS SIEM</w:t>
       </w:r>
       <w:r>
         <w:t xml:space="preserve">, the local tool for analysing the events that the in-vehicle IDS uploads to the CycurGUARD backend. It covers loading events, finding what matters, handling alerts as cases, reading vehicle details decoded from the VIN, and administering users and the audit trail.</w:t>
@@ -1336,7 +1336,7 @@
         <w:ind w:left="-397" w:right="-680"/>
       </w:pPr>
       <w:r>
-        <w:t xml:space="preserve">Applies to everyone who analyses vehicle IDS events with Fleet IDS: analysts, viewers and administrators of the vehicle cybersecurity team. The tool runs on the user’s own computer (</w:t>
+        <w:t xml:space="preserve">Applies to everyone who analyses vehicle IDS events with Fleet IDS SIEM: analysts, viewers and administrators of the vehicle cybersecurity team. The tool runs on the user’s own computer (</w:t>
       </w:r>
       <w:r>
         <w:rPr>
@@ -8547,7 +8547,7 @@
               <w:spacing w:line="276" w:lineRule="auto"/>
             </w:pPr>
             <w:r>
-              <w:t xml:space="preserve">Fleet IDS repository and README: github.com/rng0xff/idssiem</w:t>
+              <w:t xml:space="preserve">Fleet IDS SIEM repository and README: github.com/rng0xff/idssiem</w:t>
             </w:r>
           </w:p>
         </w:tc>

</xml_diff>

<commit_message>
User manual: footer shows the exact file name with its capitalization
Co-Authored-By: Claude Sonnet 5.5 <noreply@anthropic.com>
Claude-Session: https://claude.ai/code/session_014FSgcx4We9RLg8PGCKePg8
</commit_message>
<xml_diff>
--- a/docs/CORP-P2-ENG-0164-Fleet IDS SIEM - User Manual.docx
+++ b/docs/CORP-P2-ENG-0164-Fleet IDS SIEM - User Manual.docx
@@ -9068,73 +9068,13 @@
     </w:r>
     <w:r>
       <w:rPr>
-        <w:caps/>
         <w:noProof/>
         <w:color w:val="808080" w:themeColor="background1" w:themeShade="80"/>
         <w:sz w:val="18"/>
         <w:szCs w:val="18"/>
+        <w:caps w:val="0"/>
       </w:rPr>
-      <w:fldChar w:fldCharType="begin"/>
-    </w:r>
-    <w:r>
-      <w:rPr>
-        <w:caps/>
-        <w:noProof/>
-        <w:color w:val="808080" w:themeColor="background1" w:themeShade="80"/>
-        <w:sz w:val="18"/>
-        <w:szCs w:val="18"/>
-      </w:rPr>
-      <w:instrText xml:space="preserve"> FILENAME \* MERGEFORMAT </w:instrText>
-    </w:r>
-    <w:r>
-      <w:rPr>
-        <w:caps/>
-        <w:noProof/>
-        <w:color w:val="808080" w:themeColor="background1" w:themeShade="80"/>
-        <w:sz w:val="18"/>
-        <w:szCs w:val="18"/>
-      </w:rPr>
-      <w:fldChar w:fldCharType="separate"/>
-    </w:r>
-    <w:r>
-      <w:rPr>
-        <w:caps/>
-        <w:noProof/>
-        <w:color w:val="808080" w:themeColor="background1" w:themeShade="80"/>
-        <w:sz w:val="18"/>
-        <w:szCs w:val="18"/>
-      </w:rPr>
-      <w:t>Corp-M2-QM-0031_00</w:t>
-    </w:r>
-    <w:r>
-      <w:rPr>
-        <w:caps/>
-        <w:noProof/>
-        <w:color w:val="808080" w:themeColor="background1" w:themeShade="80"/>
-        <w:sz w:val="18"/>
-        <w:szCs w:val="18"/>
-      </w:rPr>
-      <w:t>3</w:t>
-    </w:r>
-    <w:r>
-      <w:rPr>
-        <w:caps/>
-        <w:noProof/>
-        <w:color w:val="808080" w:themeColor="background1" w:themeShade="80"/>
-        <w:sz w:val="18"/>
-        <w:szCs w:val="18"/>
-      </w:rPr>
-      <w:t>.docx</w:t>
-    </w:r>
-    <w:r>
-      <w:rPr>
-        <w:caps/>
-        <w:noProof/>
-        <w:color w:val="808080" w:themeColor="background1" w:themeShade="80"/>
-        <w:sz w:val="18"/>
-        <w:szCs w:val="18"/>
-      </w:rPr>
-      <w:fldChar w:fldCharType="end"/>
+      <w:t>CORP-P2-ENG-0164-Fleet IDS SIEM - User Manual</w:t>
     </w:r>
     <w:r>
       <w:rPr>

</xml_diff>

<commit_message>
Use localhost instead of 127.0.0.1 in the start message, docs and manual; redirect 127.0.0.1 to localhost so passkeys work
Co-Authored-By: Claude Sonnet 5.5 <noreply@anthropic.com>
Claude-Session: https://claude.ai/code/session_014FSgcx4We9RLg8PGCKePg8
</commit_message>
<xml_diff>
--- a/docs/CORP-P2-ENG-0164-Fleet IDS SIEM - User Manual.docx
+++ b/docs/CORP-P2-ENG-0164-Fleet IDS SIEM - User Manual.docx
@@ -1342,7 +1342,7 @@
         <w:rPr>
           <w:b/>
         </w:rPr>
-        <w:t xml:space="preserve">http://127.0.0.1:8765</w:t>
+        <w:t xml:space="preserve">http://localhost:8765</w:t>
       </w:r>
       <w:r>
         <w:t xml:space="preserve">) and reads events from an export file or from the CycurGUARD backend.</w:t>
@@ -2302,7 +2302,7 @@
                 <w:sz w:val="20"/>
                 <w:szCs w:val="20"/>
               </w:rPr>
-              <w:t xml:space="preserve"> and open http://127.0.0.1:8765. Use </w:t>
+              <w:t xml:space="preserve"> and open http://localhost:8765. Use </w:t>
             </w:r>
             <w:r>
               <w:rPr>
@@ -2544,7 +2544,7 @@
                 <w:sz w:val="20"/>
                 <w:szCs w:val="20"/>
               </w:rPr>
-              <w:t xml:space="preserve">The tool was opened as 127.0.0.1.</w:t>
+              <w:t xml:space="preserve">The tool was opened under another address, so the browser has no host name for the passkey.</w:t>
             </w:r>
           </w:p>
         </w:tc>
@@ -3597,7 +3597,7 @@
         <w:rPr>
           <w:b/>
         </w:rPr>
-        <w:t xml:space="preserve">http://127.0.0.1:8765</w:t>
+        <w:t xml:space="preserve">http://localhost:8765</w:t>
       </w:r>
       <w:r>
         <w:t xml:space="preserve"> in your browser.</w:t>
@@ -6952,7 +6952,7 @@
         <w:t xml:space="preserve">http://localhost:8765</w:t>
       </w:r>
       <w:r>
-        <w:t xml:space="preserve">, not at 127.0.0.1. Authenticator codes work at both.</w:t>
+        <w:t xml:space="preserve">, not at an IP address (127.0.0.1 is redirected to localhost). Authenticator codes work at both.</w:t>
       </w:r>
     </w:p>
     <w:p>

</xml_diff>

<commit_message>
Alert list: bulk action Add to case (existing case)
Co-Authored-By: Claude Sonnet 5.5 <noreply@anthropic.com>
Claude-Session: https://claude.ai/code/session_014FSgcx4We9RLg8PGCKePg8
</commit_message>
<xml_diff>
--- a/docs/CORP-P2-ENG-0164-Fleet IDS SIEM - User Manual.docx
+++ b/docs/CORP-P2-ENG-0164-Fleet IDS SIEM - User Manual.docx
@@ -5350,7 +5350,25 @@
       <w:r>
         <w:t xml:space="preserve">4.</w:t>
         <w:tab/>
-        <w:t xml:space="preserve">To handle several alerts alike, tick them and use the bulk actions.</w:t>
+        <w:t xml:space="preserve">To handle several alerts alike, tick them and use the bulk actions: set a status, </w:t>
+      </w:r>
+      <w:r>
+        <w:rPr>
+          <w:b/>
+        </w:rPr>
+        <w:t xml:space="preserve">Create case</w:t>
+      </w:r>
+      <w:r>
+        <w:t xml:space="preserve"> (one new case for all of them) or </w:t>
+      </w:r>
+      <w:r>
+        <w:rPr>
+          <w:b/>
+        </w:rPr>
+        <w:t xml:space="preserve">Add to case</w:t>
+      </w:r>
+      <w:r>
+        <w:t xml:space="preserve"> (all of them into an existing case). An alert can be in one case only.</w:t>
       </w:r>
     </w:p>
     <w:p>

</xml_diff>

<commit_message>
Related cases: link cases with similar topics, suggestions, list filter, report section
Co-Authored-By: Claude Sonnet 5.5 <noreply@anthropic.com>
Claude-Session: https://claude.ai/code/session_014FSgcx4We9RLg8PGCKePg8
</commit_message>
<xml_diff>
--- a/docs/CORP-P2-ENG-0164-Fleet IDS SIEM - User Manual.docx
+++ b/docs/CORP-P2-ENG-0164-Fleet IDS SIEM - User Manual.docx
@@ -5634,16 +5634,43 @@
       <w:r>
         <w:t xml:space="preserve">6.</w:t>
         <w:tab/>
-        <w:t xml:space="preserve">Write the root cause, affected vehicles and decision into </w:t>
+        <w:t xml:space="preserve">Under </w:t>
       </w:r>
       <w:r>
         <w:rPr>
           <w:b/>
         </w:rPr>
-        <w:t xml:space="preserve">Findings and decision</w:t>
-      </w:r>
-      <w:r>
-        <w:t xml:space="preserve">. Add comments for anything others should know.</w:t>
+        <w:t xml:space="preserve">Related cases</w:t>
+      </w:r>
+      <w:r>
+        <w:t xml:space="preserve"> (right column) link cases that deal with a similar topic, for example the same root cause or a duplicate: choose </w:t>
+      </w:r>
+      <w:r>
+        <w:rPr>
+          <w:b/>
+        </w:rPr>
+        <w:t xml:space="preserve">Link case</w:t>
+      </w:r>
+      <w:r>
+        <w:t xml:space="preserve">, pick the case and write why. </w:t>
+      </w:r>
+      <w:r>
+        <w:rPr>
+          <w:b/>
+        </w:rPr>
+        <w:t xml:space="preserve">Maybe related</w:t>
+      </w:r>
+      <w:r>
+        <w:t xml:space="preserve"> suggests cases with the same event type, ECU, detection, vehicle or a similar title; choose </w:t>
+      </w:r>
+      <w:r>
+        <w:rPr>
+          <w:b/>
+        </w:rPr>
+        <w:t xml:space="preserve">Link</w:t>
+      </w:r>
+      <w:r>
+        <w:t xml:space="preserve"> to accept one. The link shows in both cases, in the activity log and in the report. Closing one case does not change the other.</w:t>
       </w:r>
     </w:p>
     <w:p>
@@ -5654,25 +5681,16 @@
       <w:r>
         <w:t xml:space="preserve">7.</w:t>
         <w:tab/>
-        <w:t xml:space="preserve">Choose </w:t>
+        <w:t xml:space="preserve">Write the root cause, affected vehicles and decision into </w:t>
       </w:r>
       <w:r>
         <w:rPr>
           <w:b/>
         </w:rPr>
-        <w:t xml:space="preserve">Close case</w:t>
-      </w:r>
-      <w:r>
-        <w:t xml:space="preserve"> and pick a resolution. Open alerts of the case can be resolved at the same time. </w:t>
-      </w:r>
-      <w:r>
-        <w:rPr>
-          <w:b/>
-        </w:rPr>
-        <w:t xml:space="preserve">Reopen</w:t>
-      </w:r>
-      <w:r>
-        <w:t xml:space="preserve"> brings a closed case back.</w:t>
+        <w:t xml:space="preserve">Findings and decision</w:t>
+      </w:r>
+      <w:r>
+        <w:t xml:space="preserve">. Add comments for anything others should know.</w:t>
       </w:r>
     </w:p>
     <w:p>
@@ -5682,6 +5700,35 @@
       </w:pPr>
       <w:r>
         <w:t xml:space="preserve">8.</w:t>
+        <w:tab/>
+        <w:t xml:space="preserve">Choose </w:t>
+      </w:r>
+      <w:r>
+        <w:rPr>
+          <w:b/>
+        </w:rPr>
+        <w:t xml:space="preserve">Close case</w:t>
+      </w:r>
+      <w:r>
+        <w:t xml:space="preserve"> and pick a resolution. Open alerts of the case can be resolved at the same time. </w:t>
+      </w:r>
+      <w:r>
+        <w:rPr>
+          <w:b/>
+        </w:rPr>
+        <w:t xml:space="preserve">Reopen</w:t>
+      </w:r>
+      <w:r>
+        <w:t xml:space="preserve"> brings a closed case back.</w:t>
+      </w:r>
+    </w:p>
+    <w:p>
+      <w:pPr>
+        <w:spacing w:before="0" w:after="60" w:line="276" w:lineRule="auto"/>
+        <w:ind w:left="-37" w:right="-680" w:hanging="360"/>
+      </w:pPr>
+      <w:r>
+        <w:t xml:space="preserve">9.</w:t>
         <w:tab/>
         <w:t xml:space="preserve">Choose </w:t>
       </w:r>

</xml_diff>

<commit_message>
Manual: sequence diagram in the Activity column of the flow table
Co-Authored-By: Claude Sonnet 5.5 <noreply@anthropic.com>
Claude-Session: https://claude.ai/code/session_014FSgcx4We9RLg8PGCKePg8
</commit_message>
<xml_diff>
--- a/docs/CORP-P2-ENG-0164-Fleet IDS SIEM - User Manual.docx
+++ b/docs/CORP-P2-ENG-0164-Fleet IDS SIEM - User Manual.docx
@@ -1226,7 +1226,7 @@
                 <w:rStyle w:val="Hyperlink"/>
                 <w:noProof/>
               </w:rPr>
-              <w:t xml:space="preserve">20</w:t>
+              <w:t xml:space="preserve">21</w:t>
             </w:r>
           </w:hyperlink>
         </w:p>
@@ -7536,13 +7536,13 @@
         <w:tblLook w:val="04A0" w:firstRow="1" w:lastRow="0" w:firstColumn="1" w:lastColumn="0" w:noHBand="0" w:noVBand="1"/>
       </w:tblPr>
       <w:tblGrid>
-        <w:gridCol w:w="1350"/>
-        <w:gridCol w:w="1350"/>
-        <w:gridCol w:w="1350"/>
-        <w:gridCol w:w="1200"/>
-        <w:gridCol w:w="1300"/>
-        <w:gridCol w:w="2307"/>
-        <w:gridCol w:w="1350"/>
+        <w:gridCol w:w="1250"/>
+        <w:gridCol w:w="1250"/>
+        <w:gridCol w:w="1250"/>
+        <w:gridCol w:w="950"/>
+        <w:gridCol w:w="1050"/>
+        <w:gridCol w:w="3050"/>
+        <w:gridCol w:w="1407"/>
       </w:tblGrid>
       <w:tr>
         <w:trPr>
@@ -7550,7 +7550,7 @@
         </w:trPr>
         <w:tc>
           <w:tcPr>
-            <w:tcW w:w="1350" w:type="dxa"/>
+            <w:tcW w:w="1250" w:type="dxa"/>
             <w:shd w:val="clear" w:color="auto" w:fill="E8E8E8" w:themeFill="background2"/>
             <w:vAlign w:val="center"/>
           </w:tcPr>
@@ -7565,7 +7565,7 @@
         </w:tc>
         <w:tc>
           <w:tcPr>
-            <w:tcW w:w="1350" w:type="dxa"/>
+            <w:tcW w:w="1250" w:type="dxa"/>
             <w:shd w:val="clear" w:color="auto" w:fill="E8E8E8" w:themeFill="background2"/>
             <w:vAlign w:val="center"/>
           </w:tcPr>
@@ -7580,7 +7580,7 @@
         </w:tc>
         <w:tc>
           <w:tcPr>
-            <w:tcW w:w="1350" w:type="dxa"/>
+            <w:tcW w:w="1250" w:type="dxa"/>
             <w:shd w:val="clear" w:color="auto" w:fill="E8E8E8" w:themeFill="background2"/>
             <w:vAlign w:val="center"/>
           </w:tcPr>
@@ -7595,7 +7595,7 @@
         </w:tc>
         <w:tc>
           <w:tcPr>
-            <w:tcW w:w="1200" w:type="dxa"/>
+            <w:tcW w:w="950" w:type="dxa"/>
             <w:shd w:val="clear" w:color="auto" w:fill="E8E8E8" w:themeFill="background2"/>
             <w:vAlign w:val="center"/>
           </w:tcPr>
@@ -7610,7 +7610,7 @@
         </w:tc>
         <w:tc>
           <w:tcPr>
-            <w:tcW w:w="1300" w:type="dxa"/>
+            <w:tcW w:w="1050" w:type="dxa"/>
             <w:shd w:val="clear" w:color="auto" w:fill="E8E8E8" w:themeFill="background2"/>
             <w:vAlign w:val="center"/>
           </w:tcPr>
@@ -7625,7 +7625,7 @@
         </w:tc>
         <w:tc>
           <w:tcPr>
-            <w:tcW w:w="2307" w:type="dxa"/>
+            <w:tcW w:w="3050" w:type="dxa"/>
             <w:shd w:val="clear" w:color="auto" w:fill="E8E8E8" w:themeFill="background2"/>
             <w:vAlign w:val="center"/>
           </w:tcPr>
@@ -7640,7 +7640,7 @@
         </w:tc>
         <w:tc>
           <w:tcPr>
-            <w:tcW w:w="1350" w:type="dxa"/>
+            <w:tcW w:w="1407" w:type="dxa"/>
             <w:shd w:val="clear" w:color="auto" w:fill="E8E8E8" w:themeFill="background2"/>
             <w:vAlign w:val="center"/>
           </w:tcPr>
@@ -7656,11 +7656,11 @@
       </w:tr>
       <w:tr>
         <w:trPr>
-          <w:trHeight w:val="850"/>
+          <w:trHeight w:val="1958" w:hRule="atLeast"/>
         </w:trPr>
         <w:tc>
           <w:tcPr>
-            <w:tcW w:w="1350" w:type="dxa"/>
+            <w:tcW w:w="1250" w:type="dxa"/>
             <w:vAlign w:val="center"/>
           </w:tcPr>
           <w:p>
@@ -7681,7 +7681,7 @@
         </w:tc>
         <w:tc>
           <w:tcPr>
-            <w:tcW w:w="1350" w:type="dxa"/>
+            <w:tcW w:w="1250" w:type="dxa"/>
           </w:tcPr>
           <w:p>
             <w:pPr>
@@ -7703,7 +7703,7 @@
         </w:tc>
         <w:tc>
           <w:tcPr>
-            <w:tcW w:w="1350" w:type="dxa"/>
+            <w:tcW w:w="1250" w:type="dxa"/>
           </w:tcPr>
           <w:p>
             <w:pPr>
@@ -7717,7 +7717,7 @@
         </w:tc>
         <w:tc>
           <w:tcPr>
-            <w:tcW w:w="1200" w:type="dxa"/>
+            <w:tcW w:w="950" w:type="dxa"/>
           </w:tcPr>
           <w:p>
             <w:pPr>
@@ -7739,7 +7739,7 @@
         </w:tc>
         <w:tc>
           <w:tcPr>
-            <w:tcW w:w="1300" w:type="dxa"/>
+            <w:tcW w:w="1050" w:type="dxa"/>
           </w:tcPr>
           <w:p>
             <w:pPr>
@@ -7761,28 +7761,60 @@
         </w:tc>
         <w:tc>
           <w:tcPr>
-            <w:tcW w:w="2307" w:type="dxa"/>
-          </w:tcPr>
-          <w:p>
-            <w:pPr>
-              <w:spacing w:line="276" w:lineRule="auto"/>
+            <w:tcW w:w="3050" w:type="dxa"/>
+            <w:tcMar>
+              <w:top w:w="0" w:type="dxa"/>
+              <w:left w:w="0" w:type="dxa"/>
+              <w:bottom w:w="0" w:type="dxa"/>
+              <w:right w:w="0" w:type="dxa"/>
+            </w:tcMar>
+          </w:tcPr>
+          <w:p>
+            <w:pPr>
               <w:rPr>
                 <w:szCs w:val="20"/>
               </w:rPr>
-            </w:pPr>
-            <w:r>
-              <w:rPr>
-                <w:noProof/>
-                <w:sz w:val="16"/>
-                <w:szCs w:val="16"/>
-              </w:rPr>
-              <w:t xml:space="preserve">Import a file or sync from CycurGUARD, check data quality</w:t>
-            </w:r>
-          </w:p>
-        </w:tc>
-        <w:tc>
-          <w:tcPr>
-            <w:tcW w:w="1350" w:type="dxa"/>
+              <w:spacing w:before="0" w:after="0" w:line="240" w:lineRule="auto"/>
+            </w:pPr>
+            <w:r>
+              <w:drawing>
+                <wp:inline xmlns:a="http://schemas.openxmlformats.org/drawingml/2006/main" xmlns:pic="http://schemas.openxmlformats.org/drawingml/2006/picture">
+                  <wp:extent cx="1936749" cy="1053591"/>
+                  <wp:docPr id="1" name="Picture 1"/>
+                  <wp:cNvGraphicFramePr>
+                    <a:graphicFrameLocks noChangeAspect="1"/>
+                  </wp:cNvGraphicFramePr>
+                  <a:graphic>
+                    <a:graphicData uri="http://schemas.openxmlformats.org/drawingml/2006/picture">
+                      <pic:pic>
+                        <pic:nvPicPr>
+                          <pic:cNvPr id="0" name="s1.png"/>
+                          <pic:cNvPicPr/>
+                        </pic:nvPicPr>
+                        <pic:blipFill>
+                          <a:blip r:embed="rId31"/>
+                          <a:stretch>
+                            <a:fillRect/>
+                          </a:stretch>
+                        </pic:blipFill>
+                        <pic:spPr>
+                          <a:xfrm>
+                            <a:off x="0" y="0"/>
+                            <a:ext cx="1936749" cy="1053591"/>
+                          </a:xfrm>
+                          <a:prstGeom prst="rect"/>
+                        </pic:spPr>
+                      </pic:pic>
+                    </a:graphicData>
+                  </a:graphic>
+                </wp:inline>
+              </w:drawing>
+            </w:r>
+          </w:p>
+        </w:tc>
+        <w:tc>
+          <w:tcPr>
+            <w:tcW w:w="1407" w:type="dxa"/>
             <w:vAlign w:val="center"/>
           </w:tcPr>
           <w:p>
@@ -7806,11 +7838,11 @@
       </w:tr>
       <w:tr>
         <w:trPr>
-          <w:trHeight w:val="850"/>
+          <w:trHeight w:val="1238" w:hRule="atLeast"/>
         </w:trPr>
         <w:tc>
           <w:tcPr>
-            <w:tcW w:w="1350" w:type="dxa"/>
+            <w:tcW w:w="1250" w:type="dxa"/>
             <w:vAlign w:val="center"/>
           </w:tcPr>
           <w:p>
@@ -7831,7 +7863,7 @@
         </w:tc>
         <w:tc>
           <w:tcPr>
-            <w:tcW w:w="1350" w:type="dxa"/>
+            <w:tcW w:w="1250" w:type="dxa"/>
           </w:tcPr>
           <w:p>
             <w:pPr>
@@ -7845,7 +7877,7 @@
         </w:tc>
         <w:tc>
           <w:tcPr>
-            <w:tcW w:w="1350" w:type="dxa"/>
+            <w:tcW w:w="1250" w:type="dxa"/>
           </w:tcPr>
           <w:p>
             <w:pPr>
@@ -7867,7 +7899,7 @@
         </w:tc>
         <w:tc>
           <w:tcPr>
-            <w:tcW w:w="1200" w:type="dxa"/>
+            <w:tcW w:w="950" w:type="dxa"/>
           </w:tcPr>
           <w:p>
             <w:pPr>
@@ -7889,7 +7921,7 @@
         </w:tc>
         <w:tc>
           <w:tcPr>
-            <w:tcW w:w="1300" w:type="dxa"/>
+            <w:tcW w:w="1050" w:type="dxa"/>
           </w:tcPr>
           <w:p>
             <w:pPr>
@@ -7911,28 +7943,60 @@
         </w:tc>
         <w:tc>
           <w:tcPr>
-            <w:tcW w:w="2307" w:type="dxa"/>
-          </w:tcPr>
-          <w:p>
-            <w:pPr>
-              <w:spacing w:line="276" w:lineRule="auto"/>
+            <w:tcW w:w="3050" w:type="dxa"/>
+            <w:tcMar>
+              <w:top w:w="0" w:type="dxa"/>
+              <w:left w:w="0" w:type="dxa"/>
+              <w:bottom w:w="0" w:type="dxa"/>
+              <w:right w:w="0" w:type="dxa"/>
+            </w:tcMar>
+          </w:tcPr>
+          <w:p>
+            <w:pPr>
               <w:rPr>
                 <w:szCs w:val="20"/>
               </w:rPr>
-            </w:pPr>
-            <w:r>
-              <w:rPr>
-                <w:noProof/>
-                <w:sz w:val="16"/>
-                <w:szCs w:val="16"/>
-              </w:rPr>
-              <w:t xml:space="preserve">Run detections, review the alert queue</w:t>
-            </w:r>
-          </w:p>
-        </w:tc>
-        <w:tc>
-          <w:tcPr>
-            <w:tcW w:w="1350" w:type="dxa"/>
+              <w:spacing w:before="0" w:after="0" w:line="240" w:lineRule="auto"/>
+            </w:pPr>
+            <w:r>
+              <w:drawing>
+                <wp:inline xmlns:a="http://schemas.openxmlformats.org/drawingml/2006/main" xmlns:pic="http://schemas.openxmlformats.org/drawingml/2006/picture">
+                  <wp:extent cx="1936749" cy="664305"/>
+                  <wp:docPr id="1" name="Picture 1"/>
+                  <wp:cNvGraphicFramePr>
+                    <a:graphicFrameLocks noChangeAspect="1"/>
+                  </wp:cNvGraphicFramePr>
+                  <a:graphic>
+                    <a:graphicData uri="http://schemas.openxmlformats.org/drawingml/2006/picture">
+                      <pic:pic>
+                        <pic:nvPicPr>
+                          <pic:cNvPr id="0" name="s2.png"/>
+                          <pic:cNvPicPr/>
+                        </pic:nvPicPr>
+                        <pic:blipFill>
+                          <a:blip r:embed="rId32"/>
+                          <a:stretch>
+                            <a:fillRect/>
+                          </a:stretch>
+                        </pic:blipFill>
+                        <pic:spPr>
+                          <a:xfrm>
+                            <a:off x="0" y="0"/>
+                            <a:ext cx="1936749" cy="664305"/>
+                          </a:xfrm>
+                          <a:prstGeom prst="rect"/>
+                        </pic:spPr>
+                      </pic:pic>
+                    </a:graphicData>
+                  </a:graphic>
+                </wp:inline>
+              </w:drawing>
+            </w:r>
+          </w:p>
+        </w:tc>
+        <w:tc>
+          <w:tcPr>
+            <w:tcW w:w="1407" w:type="dxa"/>
             <w:vAlign w:val="center"/>
           </w:tcPr>
           <w:p>
@@ -7956,11 +8020,11 @@
       </w:tr>
       <w:tr>
         <w:trPr>
-          <w:trHeight w:val="850"/>
+          <w:trHeight w:val="1238" w:hRule="atLeast"/>
         </w:trPr>
         <w:tc>
           <w:tcPr>
-            <w:tcW w:w="1350" w:type="dxa"/>
+            <w:tcW w:w="1250" w:type="dxa"/>
             <w:vAlign w:val="center"/>
           </w:tcPr>
           <w:p>
@@ -7981,7 +8045,7 @@
         </w:tc>
         <w:tc>
           <w:tcPr>
-            <w:tcW w:w="1350" w:type="dxa"/>
+            <w:tcW w:w="1250" w:type="dxa"/>
           </w:tcPr>
           <w:p>
             <w:pPr>
@@ -8003,7 +8067,7 @@
         </w:tc>
         <w:tc>
           <w:tcPr>
-            <w:tcW w:w="1350" w:type="dxa"/>
+            <w:tcW w:w="1250" w:type="dxa"/>
           </w:tcPr>
           <w:p>
             <w:pPr>
@@ -8025,7 +8089,7 @@
         </w:tc>
         <w:tc>
           <w:tcPr>
-            <w:tcW w:w="1200" w:type="dxa"/>
+            <w:tcW w:w="950" w:type="dxa"/>
           </w:tcPr>
           <w:p>
             <w:pPr>
@@ -8047,7 +8111,7 @@
         </w:tc>
         <w:tc>
           <w:tcPr>
-            <w:tcW w:w="1300" w:type="dxa"/>
+            <w:tcW w:w="1050" w:type="dxa"/>
           </w:tcPr>
           <w:p>
             <w:pPr>
@@ -8069,28 +8133,60 @@
         </w:tc>
         <w:tc>
           <w:tcPr>
-            <w:tcW w:w="2307" w:type="dxa"/>
-          </w:tcPr>
-          <w:p>
-            <w:pPr>
-              <w:spacing w:line="276" w:lineRule="auto"/>
+            <w:tcW w:w="3050" w:type="dxa"/>
+            <w:tcMar>
+              <w:top w:w="0" w:type="dxa"/>
+              <w:left w:w="0" w:type="dxa"/>
+              <w:bottom w:w="0" w:type="dxa"/>
+              <w:right w:w="0" w:type="dxa"/>
+            </w:tcMar>
+          </w:tcPr>
+          <w:p>
+            <w:pPr>
               <w:rPr>
                 <w:szCs w:val="20"/>
               </w:rPr>
-            </w:pPr>
-            <w:r>
-              <w:rPr>
-                <w:noProof/>
-                <w:sz w:val="16"/>
-                <w:szCs w:val="16"/>
-              </w:rPr>
-              <w:t xml:space="preserve">Triage the alert, add a note, create a case if needed</w:t>
-            </w:r>
-          </w:p>
-        </w:tc>
-        <w:tc>
-          <w:tcPr>
-            <w:tcW w:w="1350" w:type="dxa"/>
+              <w:spacing w:before="0" w:after="0" w:line="240" w:lineRule="auto"/>
+            </w:pPr>
+            <w:r>
+              <w:drawing>
+                <wp:inline xmlns:a="http://schemas.openxmlformats.org/drawingml/2006/main" xmlns:pic="http://schemas.openxmlformats.org/drawingml/2006/picture">
+                  <wp:extent cx="1936749" cy="668178"/>
+                  <wp:docPr id="1" name="Picture 1"/>
+                  <wp:cNvGraphicFramePr>
+                    <a:graphicFrameLocks noChangeAspect="1"/>
+                  </wp:cNvGraphicFramePr>
+                  <a:graphic>
+                    <a:graphicData uri="http://schemas.openxmlformats.org/drawingml/2006/picture">
+                      <pic:pic>
+                        <pic:nvPicPr>
+                          <pic:cNvPr id="0" name="s3.png"/>
+                          <pic:cNvPicPr/>
+                        </pic:nvPicPr>
+                        <pic:blipFill>
+                          <a:blip r:embed="rId33"/>
+                          <a:stretch>
+                            <a:fillRect/>
+                          </a:stretch>
+                        </pic:blipFill>
+                        <pic:spPr>
+                          <a:xfrm>
+                            <a:off x="0" y="0"/>
+                            <a:ext cx="1936749" cy="668178"/>
+                          </a:xfrm>
+                          <a:prstGeom prst="rect"/>
+                        </pic:spPr>
+                      </pic:pic>
+                    </a:graphicData>
+                  </a:graphic>
+                </wp:inline>
+              </w:drawing>
+            </w:r>
+          </w:p>
+        </w:tc>
+        <w:tc>
+          <w:tcPr>
+            <w:tcW w:w="1407" w:type="dxa"/>
             <w:vAlign w:val="center"/>
           </w:tcPr>
           <w:p>
@@ -8112,11 +8208,11 @@
       </w:tr>
       <w:tr>
         <w:trPr>
-          <w:trHeight w:val="850"/>
+          <w:trHeight w:val="1238" w:hRule="atLeast"/>
         </w:trPr>
         <w:tc>
           <w:tcPr>
-            <w:tcW w:w="1350" w:type="dxa"/>
+            <w:tcW w:w="1250" w:type="dxa"/>
             <w:vAlign w:val="center"/>
           </w:tcPr>
           <w:p>
@@ -8137,7 +8233,7 @@
         </w:tc>
         <w:tc>
           <w:tcPr>
-            <w:tcW w:w="1350" w:type="dxa"/>
+            <w:tcW w:w="1250" w:type="dxa"/>
           </w:tcPr>
           <w:p>
             <w:pPr>
@@ -8159,7 +8255,7 @@
         </w:tc>
         <w:tc>
           <w:tcPr>
-            <w:tcW w:w="1350" w:type="dxa"/>
+            <w:tcW w:w="1250" w:type="dxa"/>
           </w:tcPr>
           <w:p>
             <w:pPr>
@@ -8181,7 +8277,7 @@
         </w:tc>
         <w:tc>
           <w:tcPr>
-            <w:tcW w:w="1200" w:type="dxa"/>
+            <w:tcW w:w="950" w:type="dxa"/>
           </w:tcPr>
           <w:p>
             <w:pPr>
@@ -8203,7 +8299,7 @@
         </w:tc>
         <w:tc>
           <w:tcPr>
-            <w:tcW w:w="1300" w:type="dxa"/>
+            <w:tcW w:w="1050" w:type="dxa"/>
           </w:tcPr>
           <w:p>
             <w:pPr>
@@ -8225,29 +8321,61 @@
         </w:tc>
         <w:tc>
           <w:tcPr>
-            <w:tcW w:w="2307" w:type="dxa"/>
-          </w:tcPr>
-          <w:p>
-            <w:pPr>
-              <w:spacing w:line="276" w:lineRule="auto"/>
+            <w:tcW w:w="3050" w:type="dxa"/>
+            <w:tcMar>
+              <w:top w:w="0" w:type="dxa"/>
+              <w:left w:w="0" w:type="dxa"/>
+              <w:bottom w:w="0" w:type="dxa"/>
+              <w:right w:w="0" w:type="dxa"/>
+            </w:tcMar>
+          </w:tcPr>
+          <w:p>
+            <w:pPr>
               <w:rPr>
                 <w:noProof/>
                 <w:szCs w:val="20"/>
               </w:rPr>
-            </w:pPr>
-            <w:r>
-              <w:rPr>
-                <w:noProof/>
-                <w:sz w:val="16"/>
-                <w:szCs w:val="16"/>
-              </w:rPr>
-              <w:t xml:space="preserve">Work the checklist, record findings, close</w:t>
-            </w:r>
-          </w:p>
-        </w:tc>
-        <w:tc>
-          <w:tcPr>
-            <w:tcW w:w="1350" w:type="dxa"/>
+              <w:spacing w:before="0" w:after="0" w:line="240" w:lineRule="auto"/>
+            </w:pPr>
+            <w:r>
+              <w:drawing>
+                <wp:inline xmlns:a="http://schemas.openxmlformats.org/drawingml/2006/main" xmlns:pic="http://schemas.openxmlformats.org/drawingml/2006/picture">
+                  <wp:extent cx="1936749" cy="666242"/>
+                  <wp:docPr id="1" name="Picture 1"/>
+                  <wp:cNvGraphicFramePr>
+                    <a:graphicFrameLocks noChangeAspect="1"/>
+                  </wp:cNvGraphicFramePr>
+                  <a:graphic>
+                    <a:graphicData uri="http://schemas.openxmlformats.org/drawingml/2006/picture">
+                      <pic:pic>
+                        <pic:nvPicPr>
+                          <pic:cNvPr id="0" name="s4.png"/>
+                          <pic:cNvPicPr/>
+                        </pic:nvPicPr>
+                        <pic:blipFill>
+                          <a:blip r:embed="rId34"/>
+                          <a:stretch>
+                            <a:fillRect/>
+                          </a:stretch>
+                        </pic:blipFill>
+                        <pic:spPr>
+                          <a:xfrm>
+                            <a:off x="0" y="0"/>
+                            <a:ext cx="1936749" cy="666242"/>
+                          </a:xfrm>
+                          <a:prstGeom prst="rect"/>
+                        </pic:spPr>
+                      </pic:pic>
+                    </a:graphicData>
+                  </a:graphic>
+                </wp:inline>
+              </w:drawing>
+            </w:r>
+          </w:p>
+        </w:tc>
+        <w:tc>
+          <w:tcPr>
+            <w:tcW w:w="1407" w:type="dxa"/>
             <w:vAlign w:val="center"/>
           </w:tcPr>
           <w:p>
@@ -8271,11 +8399,11 @@
       </w:tr>
       <w:tr>
         <w:trPr>
-          <w:trHeight w:val="850"/>
+          <w:trHeight w:val="1238" w:hRule="atLeast"/>
         </w:trPr>
         <w:tc>
           <w:tcPr>
-            <w:tcW w:w="1350" w:type="dxa"/>
+            <w:tcW w:w="1250" w:type="dxa"/>
             <w:vAlign w:val="center"/>
           </w:tcPr>
           <w:p>
@@ -8296,7 +8424,7 @@
         </w:tc>
         <w:tc>
           <w:tcPr>
-            <w:tcW w:w="1350" w:type="dxa"/>
+            <w:tcW w:w="1250" w:type="dxa"/>
           </w:tcPr>
           <w:p>
             <w:pPr>
@@ -8310,7 +8438,7 @@
         </w:tc>
         <w:tc>
           <w:tcPr>
-            <w:tcW w:w="1350" w:type="dxa"/>
+            <w:tcW w:w="1250" w:type="dxa"/>
           </w:tcPr>
           <w:p>
             <w:pPr>
@@ -8332,7 +8460,7 @@
         </w:tc>
         <w:tc>
           <w:tcPr>
-            <w:tcW w:w="1200" w:type="dxa"/>
+            <w:tcW w:w="950" w:type="dxa"/>
           </w:tcPr>
           <w:p>
             <w:pPr>
@@ -8354,7 +8482,7 @@
         </w:tc>
         <w:tc>
           <w:tcPr>
-            <w:tcW w:w="1300" w:type="dxa"/>
+            <w:tcW w:w="1050" w:type="dxa"/>
           </w:tcPr>
           <w:p>
             <w:pPr>
@@ -8376,29 +8504,61 @@
         </w:tc>
         <w:tc>
           <w:tcPr>
-            <w:tcW w:w="2307" w:type="dxa"/>
-          </w:tcPr>
-          <w:p>
-            <w:pPr>
-              <w:spacing w:line="276" w:lineRule="auto"/>
+            <w:tcW w:w="3050" w:type="dxa"/>
+            <w:tcMar>
+              <w:top w:w="0" w:type="dxa"/>
+              <w:left w:w="0" w:type="dxa"/>
+              <w:bottom w:w="0" w:type="dxa"/>
+              <w:right w:w="0" w:type="dxa"/>
+            </w:tcMar>
+          </w:tcPr>
+          <w:p>
+            <w:pPr>
               <w:rPr>
                 <w:noProof/>
                 <w:szCs w:val="20"/>
               </w:rPr>
-            </w:pPr>
-            <w:r>
-              <w:rPr>
-                <w:noProof/>
-                <w:sz w:val="16"/>
-                <w:szCs w:val="16"/>
-              </w:rPr>
-              <w:t xml:space="preserve">Verify integrity and export on request</w:t>
-            </w:r>
-          </w:p>
-        </w:tc>
-        <w:tc>
-          <w:tcPr>
-            <w:tcW w:w="1350" w:type="dxa"/>
+              <w:spacing w:before="0" w:after="0" w:line="240" w:lineRule="auto"/>
+            </w:pPr>
+            <w:r>
+              <w:drawing>
+                <wp:inline xmlns:a="http://schemas.openxmlformats.org/drawingml/2006/main" xmlns:pic="http://schemas.openxmlformats.org/drawingml/2006/picture">
+                  <wp:extent cx="1936749" cy="666242"/>
+                  <wp:docPr id="1" name="Picture 1"/>
+                  <wp:cNvGraphicFramePr>
+                    <a:graphicFrameLocks noChangeAspect="1"/>
+                  </wp:cNvGraphicFramePr>
+                  <a:graphic>
+                    <a:graphicData uri="http://schemas.openxmlformats.org/drawingml/2006/picture">
+                      <pic:pic>
+                        <pic:nvPicPr>
+                          <pic:cNvPr id="0" name="s5.png"/>
+                          <pic:cNvPicPr/>
+                        </pic:nvPicPr>
+                        <pic:blipFill>
+                          <a:blip r:embed="rId35"/>
+                          <a:stretch>
+                            <a:fillRect/>
+                          </a:stretch>
+                        </pic:blipFill>
+                        <pic:spPr>
+                          <a:xfrm>
+                            <a:off x="0" y="0"/>
+                            <a:ext cx="1936749" cy="666242"/>
+                          </a:xfrm>
+                          <a:prstGeom prst="rect"/>
+                        </pic:spPr>
+                      </pic:pic>
+                    </a:graphicData>
+                  </a:graphic>
+                </wp:inline>
+              </w:drawing>
+            </w:r>
+          </w:p>
+        </w:tc>
+        <w:tc>
+          <w:tcPr>
+            <w:tcW w:w="1407" w:type="dxa"/>
             <w:vAlign w:val="center"/>
           </w:tcPr>
           <w:p>

</xml_diff>

<commit_message>
Manual: checklist status, technical experts, default checklist, updated screenshots (revision stays 001)
Co-Authored-By: Claude Sonnet 5.5 <noreply@anthropic.com>
Claude-Session: https://claude.ai/code/session_014FSgcx4We9RLg8PGCKePg8
</commit_message>
<xml_diff>
--- a/docs/CORP-P2-ENG-0164-Fleet IDS SIEM - User Manual.docx
+++ b/docs/CORP-P2-ENG-0164-Fleet IDS SIEM - User Manual.docx
@@ -974,7 +974,7 @@
                 <w:rStyle w:val="Hyperlink"/>
                 <w:noProof/>
               </w:rPr>
-              <w:t xml:space="preserve">15</w:t>
+              <w:t xml:space="preserve">16</w:t>
             </w:r>
           </w:hyperlink>
         </w:p>
@@ -1016,7 +1016,7 @@
                 <w:rStyle w:val="Hyperlink"/>
                 <w:noProof/>
               </w:rPr>
-              <w:t xml:space="preserve">17</w:t>
+              <w:t xml:space="preserve">18</w:t>
             </w:r>
           </w:hyperlink>
         </w:p>
@@ -1058,7 +1058,7 @@
                 <w:rStyle w:val="Hyperlink"/>
                 <w:noProof/>
               </w:rPr>
-              <w:t xml:space="preserve">18</w:t>
+              <w:t xml:space="preserve">19</w:t>
             </w:r>
           </w:hyperlink>
         </w:p>
@@ -1100,7 +1100,7 @@
                 <w:rStyle w:val="Hyperlink"/>
                 <w:noProof/>
               </w:rPr>
-              <w:t xml:space="preserve">19</w:t>
+              <w:t xml:space="preserve">20</w:t>
             </w:r>
           </w:hyperlink>
         </w:p>
@@ -1142,7 +1142,7 @@
                 <w:rStyle w:val="Hyperlink"/>
                 <w:noProof/>
               </w:rPr>
-              <w:t xml:space="preserve">20</w:t>
+              <w:t xml:space="preserve">21</w:t>
             </w:r>
           </w:hyperlink>
         </w:p>
@@ -1184,7 +1184,7 @@
                 <w:rStyle w:val="Hyperlink"/>
                 <w:noProof/>
               </w:rPr>
-              <w:t xml:space="preserve">20</w:t>
+              <w:t xml:space="preserve">21</w:t>
             </w:r>
           </w:hyperlink>
         </w:p>
@@ -1226,7 +1226,7 @@
                 <w:rStyle w:val="Hyperlink"/>
                 <w:noProof/>
               </w:rPr>
-              <w:t xml:space="preserve">21</w:t>
+              <w:t xml:space="preserve">22</w:t>
             </w:r>
           </w:hyperlink>
         </w:p>
@@ -1268,7 +1268,7 @@
                 <w:rStyle w:val="Hyperlink"/>
                 <w:noProof/>
               </w:rPr>
-              <w:t xml:space="preserve">21</w:t>
+              <w:t xml:space="preserve">22</w:t>
             </w:r>
           </w:hyperlink>
           <w:r>
@@ -5583,7 +5583,7 @@
       <w:r>
         <w:t xml:space="preserve">3.</w:t>
         <w:tab/>
-        <w:t xml:space="preserve">Work through the checklist. The default tasks are: review the linked events and the vehicle history; check whether other vehicles show the same pattern; confirm with the system or component owner; assess the impact on TARA threat scenarios and CSMS; decide on the response and whether reporting is needed; document the findings. Add or remove tasks as needed. To change the order, drag a step by the dots at its left, or use the arrows that appear when you point at it.</w:t>
+        <w:t xml:space="preserve">Work through the checklist. The default steps are: review the linked events and the vehicle history; check whether other vehicles show the same pattern; confirm with the system or component owner; document the technical experts you consulted; assess the impact on TARA threat scenarios and CSMS; decide on the response and whether reporting is needed; document the findings. Add or remove steps as needed. To change the order, drag a step by the dots at its left, or use the arrows that appear when you point at it.</w:t>
       </w:r>
     </w:p>
     <w:p>
@@ -5594,7 +5594,43 @@
       <w:r>
         <w:t xml:space="preserve">4.</w:t>
         <w:tab/>
-        <w:t xml:space="preserve">Write the result of each step into the box under the task, for example what you found or decided. It is saved when you leave the box and appears in the activity log and in the case report.</w:t>
+        <w:t xml:space="preserve">Set the status of each step: </w:t>
+      </w:r>
+      <w:r>
+        <w:rPr>
+          <w:b/>
+        </w:rPr>
+        <w:t xml:space="preserve">Not started</w:t>
+      </w:r>
+      <w:r>
+        <w:t xml:space="preserve">, </w:t>
+      </w:r>
+      <w:r>
+        <w:rPr>
+          <w:b/>
+        </w:rPr>
+        <w:t xml:space="preserve">Ongoing</w:t>
+      </w:r>
+      <w:r>
+        <w:t xml:space="preserve">, </w:t>
+      </w:r>
+      <w:r>
+        <w:rPr>
+          <w:b/>
+        </w:rPr>
+        <w:t xml:space="preserve">Waiting for reply</w:t>
+      </w:r>
+      <w:r>
+        <w:t xml:space="preserve"> (you asked someone and wait for the answer) or </w:t>
+      </w:r>
+      <w:r>
+        <w:rPr>
+          <w:b/>
+        </w:rPr>
+        <w:t xml:space="preserve">Completed</w:t>
+      </w:r>
+      <w:r>
+        <w:t xml:space="preserve">. Only completed steps count as done in the progress bar, which also names the ongoing and waiting ones. Every change is written to the activity log.</w:t>
       </w:r>
     </w:p>
     <w:p>
@@ -5605,25 +5641,7 @@
       <w:r>
         <w:t xml:space="preserve">5.</w:t>
         <w:tab/>
-        <w:t xml:space="preserve">Set the status to </w:t>
-      </w:r>
-      <w:r>
-        <w:rPr>
-          <w:b/>
-        </w:rPr>
-        <w:t xml:space="preserve">Investigating</w:t>
-      </w:r>
-      <w:r>
-        <w:t xml:space="preserve"> or </w:t>
-      </w:r>
-      <w:r>
-        <w:rPr>
-          <w:b/>
-        </w:rPr>
-        <w:t xml:space="preserve">Waiting</w:t>
-      </w:r>
-      <w:r>
-        <w:t xml:space="preserve"> as the work moves. Link or unlink alerts when the picture changes.</w:t>
+        <w:t xml:space="preserve">Write the result of each step into the box under it, for example what you found or decided. It is saved when you leave the box and appears in the activity log and in the case report.</w:t>
       </w:r>
     </w:p>
     <w:p>
@@ -5634,43 +5652,25 @@
       <w:r>
         <w:t xml:space="preserve">6.</w:t>
         <w:tab/>
-        <w:t xml:space="preserve">Under </w:t>
+        <w:t xml:space="preserve">Document the technical experts you ask in the panel </w:t>
       </w:r>
       <w:r>
         <w:rPr>
           <w:b/>
         </w:rPr>
-        <w:t xml:space="preserve">Related cases</w:t>
-      </w:r>
-      <w:r>
-        <w:t xml:space="preserve"> (right column) link cases that deal with a similar topic, for example the same root cause or a duplicate: choose </w:t>
+        <w:t xml:space="preserve">Technical experts</w:t>
+      </w:r>
+      <w:r>
+        <w:t xml:space="preserve">: choose </w:t>
       </w:r>
       <w:r>
         <w:rPr>
           <w:b/>
         </w:rPr>
-        <w:t xml:space="preserve">Link case</w:t>
-      </w:r>
-      <w:r>
-        <w:t xml:space="preserve">, pick the case and write why. </w:t>
-      </w:r>
-      <w:r>
-        <w:rPr>
-          <w:b/>
-        </w:rPr>
-        <w:t xml:space="preserve">Maybe related</w:t>
-      </w:r>
-      <w:r>
-        <w:t xml:space="preserve"> suggests cases with the same event type, ECU, detection, vehicle or a similar title; choose </w:t>
-      </w:r>
-      <w:r>
-        <w:rPr>
-          <w:b/>
-        </w:rPr>
-        <w:t xml:space="preserve">Link</w:t>
-      </w:r>
-      <w:r>
-        <w:t xml:space="preserve"> to accept one. The link shows in both cases, in the activity log and in the report. Closing one case does not change the other.</w:t>
+        <w:t xml:space="preserve">Add expert</w:t>
+      </w:r>
+      <w:r>
+        <w:t xml:space="preserve"> and enter name, organisation or team, system or component, contact, the date and what the expert said. Names used in any case are proposed while you type and fill in organisation, system or component and contact when those fields are empty. Entries can be edited and removed.</w:t>
       </w:r>
     </w:p>
     <w:p>
@@ -5681,16 +5681,25 @@
       <w:r>
         <w:t xml:space="preserve">7.</w:t>
         <w:tab/>
-        <w:t xml:space="preserve">Write the root cause, affected vehicles and decision into </w:t>
+        <w:t xml:space="preserve">To tie an expert to a step, choose the expert in the </w:t>
       </w:r>
       <w:r>
         <w:rPr>
           <w:b/>
         </w:rPr>
-        <w:t xml:space="preserve">Findings and decision</w:t>
-      </w:r>
-      <w:r>
-        <w:t xml:space="preserve">. Add comments for anything others should know.</w:t>
+        <w:t xml:space="preserve">Expert</w:t>
+      </w:r>
+      <w:r>
+        <w:t xml:space="preserve"> field under the step, or </w:t>
+      </w:r>
+      <w:r>
+        <w:rPr>
+          <w:b/>
+        </w:rPr>
+        <w:t xml:space="preserve">New expert...</w:t>
+      </w:r>
+      <w:r>
+        <w:t xml:space="preserve"> to add one on the spot. The experts are listed in the case report, next to the steps they belong to.</w:t>
       </w:r>
     </w:p>
     <w:p>
@@ -5701,25 +5710,25 @@
       <w:r>
         <w:t xml:space="preserve">8.</w:t>
         <w:tab/>
-        <w:t xml:space="preserve">Choose </w:t>
+        <w:t xml:space="preserve">Set the status to </w:t>
       </w:r>
       <w:r>
         <w:rPr>
           <w:b/>
         </w:rPr>
-        <w:t xml:space="preserve">Close case</w:t>
-      </w:r>
-      <w:r>
-        <w:t xml:space="preserve"> and pick a resolution. Open alerts of the case can be resolved at the same time. </w:t>
+        <w:t xml:space="preserve">Investigating</w:t>
+      </w:r>
+      <w:r>
+        <w:t xml:space="preserve"> or </w:t>
       </w:r>
       <w:r>
         <w:rPr>
           <w:b/>
         </w:rPr>
-        <w:t xml:space="preserve">Reopen</w:t>
-      </w:r>
-      <w:r>
-        <w:t xml:space="preserve"> brings a closed case back.</w:t>
+        <w:t xml:space="preserve">Waiting</w:t>
+      </w:r>
+      <w:r>
+        <w:t xml:space="preserve"> as the work moves. Link or unlink alerts when the picture changes.</w:t>
       </w:r>
     </w:p>
     <w:p>
@@ -5729,6 +5738,102 @@
       </w:pPr>
       <w:r>
         <w:t xml:space="preserve">9.</w:t>
+        <w:tab/>
+        <w:t xml:space="preserve">Under </w:t>
+      </w:r>
+      <w:r>
+        <w:rPr>
+          <w:b/>
+        </w:rPr>
+        <w:t xml:space="preserve">Related cases</w:t>
+      </w:r>
+      <w:r>
+        <w:t xml:space="preserve"> (right column) link cases that deal with a similar topic, for example the same root cause or a duplicate: choose </w:t>
+      </w:r>
+      <w:r>
+        <w:rPr>
+          <w:b/>
+        </w:rPr>
+        <w:t xml:space="preserve">Link case</w:t>
+      </w:r>
+      <w:r>
+        <w:t xml:space="preserve">, pick the case and write why. </w:t>
+      </w:r>
+      <w:r>
+        <w:rPr>
+          <w:b/>
+        </w:rPr>
+        <w:t xml:space="preserve">Maybe related</w:t>
+      </w:r>
+      <w:r>
+        <w:t xml:space="preserve"> suggests cases with the same event type, ECU, detection, vehicle or a similar title; choose </w:t>
+      </w:r>
+      <w:r>
+        <w:rPr>
+          <w:b/>
+        </w:rPr>
+        <w:t xml:space="preserve">Link</w:t>
+      </w:r>
+      <w:r>
+        <w:t xml:space="preserve"> to accept one. The link shows in both cases, in the activity log and in the report. Closing one case does not change the other.</w:t>
+      </w:r>
+    </w:p>
+    <w:p>
+      <w:pPr>
+        <w:spacing w:before="0" w:after="60" w:line="276" w:lineRule="auto"/>
+        <w:ind w:left="-37" w:right="-680" w:hanging="360"/>
+      </w:pPr>
+      <w:r>
+        <w:t xml:space="preserve">10.</w:t>
+        <w:tab/>
+        <w:t xml:space="preserve">Write the root cause, affected vehicles and decision into </w:t>
+      </w:r>
+      <w:r>
+        <w:rPr>
+          <w:b/>
+        </w:rPr>
+        <w:t xml:space="preserve">Findings and decision</w:t>
+      </w:r>
+      <w:r>
+        <w:t xml:space="preserve">. Add comments for anything others should know.</w:t>
+      </w:r>
+    </w:p>
+    <w:p>
+      <w:pPr>
+        <w:spacing w:before="0" w:after="60" w:line="276" w:lineRule="auto"/>
+        <w:ind w:left="-37" w:right="-680" w:hanging="360"/>
+      </w:pPr>
+      <w:r>
+        <w:t xml:space="preserve">11.</w:t>
+        <w:tab/>
+        <w:t xml:space="preserve">Choose </w:t>
+      </w:r>
+      <w:r>
+        <w:rPr>
+          <w:b/>
+        </w:rPr>
+        <w:t xml:space="preserve">Close case</w:t>
+      </w:r>
+      <w:r>
+        <w:t xml:space="preserve"> and pick a resolution. Open alerts of the case can be resolved at the same time. </w:t>
+      </w:r>
+      <w:r>
+        <w:rPr>
+          <w:b/>
+        </w:rPr>
+        <w:t xml:space="preserve">Reopen</w:t>
+      </w:r>
+      <w:r>
+        <w:t xml:space="preserve"> brings a closed case back.</w:t>
+      </w:r>
+    </w:p>
+    <w:p>
+      <w:pPr>
+        <w:spacing w:before="0" w:after="60" w:line="276" w:lineRule="auto"/>
+        <w:ind w:left="-37" w:right="-680" w:hanging="360"/>
+      </w:pPr>
+      <w:r>
+        <w:t xml:space="preserve">12.</w:t>
         <w:tab/>
         <w:t xml:space="preserve">Choose </w:t>
       </w:r>
@@ -5752,7 +5857,7 @@
       <w:r>
         <w:drawing>
           <wp:inline xmlns:a="http://schemas.openxmlformats.org/drawingml/2006/main" xmlns:pic="http://schemas.openxmlformats.org/drawingml/2006/picture">
-            <wp:extent cx="5760720" cy="3456432"/>
+            <wp:extent cx="4937760" cy="3291840"/>
             <wp:docPr id="1" name="Picture 1"/>
             <wp:cNvGraphicFramePr>
               <a:graphicFrameLocks noChangeAspect="1"/>
@@ -5773,7 +5878,7 @@
                   <pic:spPr>
                     <a:xfrm>
                       <a:off x="0" y="0"/>
-                      <a:ext cx="5760720" cy="3456432"/>
+                      <a:ext cx="4937760" cy="3291840"/>
                     </a:xfrm>
                     <a:prstGeom prst="rect"/>
                   </pic:spPr>
@@ -5800,15 +5905,6 @@
     </w:p>
     <w:p>
       <w:pPr>
-        <w:spacing w:before="60" w:after="60" w:line="276" w:lineRule="auto"/>
-        <w:ind w:left="-397" w:right="-680"/>
-      </w:pPr>
-      <w:r>
-        <w:t xml:space="preserve">The report contains the case facts, summary, findings and decision, the vehicles with their decoded VIN, the linked alerts, the checklist and the full activity log, all in UTC.</w:t>
-      </w:r>
-    </w:p>
-    <w:p>
-      <w:pPr>
         <w:keepNext/>
         <w:spacing w:before="80" w:after="40"/>
         <w:spacing w:line="276" w:lineRule="auto"/>
@@ -5817,7 +5913,128 @@
       <w:r>
         <w:drawing>
           <wp:inline xmlns:a="http://schemas.openxmlformats.org/drawingml/2006/main" xmlns:pic="http://schemas.openxmlformats.org/drawingml/2006/picture">
-            <wp:extent cx="4937760" cy="6748272"/>
+            <wp:extent cx="4937760" cy="3291840"/>
+            <wp:docPr id="1" name="Picture 1"/>
+            <wp:cNvGraphicFramePr>
+              <a:graphicFrameLocks noChangeAspect="1"/>
+            </wp:cNvGraphicFramePr>
+            <a:graphic>
+              <a:graphicData uri="http://schemas.openxmlformats.org/drawingml/2006/picture">
+                <pic:pic>
+                  <pic:nvPicPr>
+                    <pic:cNvPr id="0" name="16_checklist.png"/>
+                    <pic:cNvPicPr/>
+                  </pic:nvPicPr>
+                  <pic:blipFill>
+                    <a:blip r:embed="rId23"/>
+                    <a:stretch>
+                      <a:fillRect/>
+                    </a:stretch>
+                  </pic:blipFill>
+                  <pic:spPr>
+                    <a:xfrm>
+                      <a:off x="0" y="0"/>
+                      <a:ext cx="4937760" cy="3291840"/>
+                    </a:xfrm>
+                    <a:prstGeom prst="rect"/>
+                  </pic:spPr>
+                </pic:pic>
+              </a:graphicData>
+            </a:graphic>
+          </wp:inline>
+        </w:drawing>
+      </w:r>
+    </w:p>
+    <w:p>
+      <w:pPr>
+        <w:spacing w:before="0" w:after="140" w:line="276" w:lineRule="auto"/>
+        <w:ind w:left="-397" w:right="-680"/>
+      </w:pPr>
+      <w:r>
+        <w:rPr>
+          <w:i/>
+          <w:sz w:val="18"/>
+          <w:szCs w:val="18"/>
+        </w:rPr>
+        <w:t xml:space="preserve">Figure 9: Checklist with status and expert per step</w:t>
+      </w:r>
+    </w:p>
+    <w:p>
+      <w:pPr>
+        <w:keepNext/>
+        <w:spacing w:before="80" w:after="40"/>
+        <w:spacing w:line="276" w:lineRule="auto"/>
+        <w:ind w:left="-397" w:right="-680"/>
+      </w:pPr>
+      <w:r>
+        <w:drawing>
+          <wp:inline xmlns:a="http://schemas.openxmlformats.org/drawingml/2006/main" xmlns:pic="http://schemas.openxmlformats.org/drawingml/2006/picture">
+            <wp:extent cx="4389120" cy="2926080"/>
+            <wp:docPr id="1" name="Picture 1"/>
+            <wp:cNvGraphicFramePr>
+              <a:graphicFrameLocks noChangeAspect="1"/>
+            </wp:cNvGraphicFramePr>
+            <a:graphic>
+              <a:graphicData uri="http://schemas.openxmlformats.org/drawingml/2006/picture">
+                <pic:pic>
+                  <pic:nvPicPr>
+                    <pic:cNvPr id="0" name="17_expert.png"/>
+                    <pic:cNvPicPr/>
+                  </pic:nvPicPr>
+                  <pic:blipFill>
+                    <a:blip r:embed="rId24"/>
+                    <a:stretch>
+                      <a:fillRect/>
+                    </a:stretch>
+                  </pic:blipFill>
+                  <pic:spPr>
+                    <a:xfrm>
+                      <a:off x="0" y="0"/>
+                      <a:ext cx="4389120" cy="2926080"/>
+                    </a:xfrm>
+                    <a:prstGeom prst="rect"/>
+                  </pic:spPr>
+                </pic:pic>
+              </a:graphicData>
+            </a:graphic>
+          </wp:inline>
+        </w:drawing>
+      </w:r>
+    </w:p>
+    <w:p>
+      <w:pPr>
+        <w:spacing w:before="0" w:after="140" w:line="276" w:lineRule="auto"/>
+        <w:ind w:left="-397" w:right="-680"/>
+      </w:pPr>
+      <w:r>
+        <w:rPr>
+          <w:i/>
+          <w:sz w:val="18"/>
+          <w:szCs w:val="18"/>
+        </w:rPr>
+        <w:t xml:space="preserve">Figure 10: Documenting a technical expert</w:t>
+      </w:r>
+    </w:p>
+    <w:p>
+      <w:pPr>
+        <w:spacing w:before="60" w:after="60" w:line="276" w:lineRule="auto"/>
+        <w:ind w:left="-397" w:right="-680"/>
+      </w:pPr>
+      <w:r>
+        <w:t xml:space="preserve">The report contains the case facts, summary, findings and decision, the vehicles with their decoded VIN, the linked alerts, the related cases, the checklist with status and expert per step, the technical experts and the full activity log, all in UTC.</w:t>
+      </w:r>
+    </w:p>
+    <w:p>
+      <w:pPr>
+        <w:keepNext/>
+        <w:spacing w:before="80" w:after="40"/>
+        <w:spacing w:line="276" w:lineRule="auto"/>
+        <w:ind w:left="-397" w:right="-680"/>
+      </w:pPr>
+      <w:r>
+        <w:drawing>
+          <wp:inline xmlns:a="http://schemas.openxmlformats.org/drawingml/2006/main" xmlns:pic="http://schemas.openxmlformats.org/drawingml/2006/picture">
+            <wp:extent cx="4023360" cy="5486400"/>
             <wp:docPr id="1" name="Picture 1"/>
             <wp:cNvGraphicFramePr>
               <a:graphicFrameLocks noChangeAspect="1"/>
@@ -5830,7 +6047,7 @@
                     <pic:cNvPicPr/>
                   </pic:nvPicPr>
                   <pic:blipFill>
-                    <a:blip r:embed="rId23"/>
+                    <a:blip r:embed="rId25"/>
                     <a:stretch>
                       <a:fillRect/>
                     </a:stretch>
@@ -5838,7 +6055,7 @@
                   <pic:spPr>
                     <a:xfrm>
                       <a:off x="0" y="0"/>
-                      <a:ext cx="4937760" cy="6748272"/>
+                      <a:ext cx="4023360" cy="5486400"/>
                     </a:xfrm>
                     <a:prstGeom prst="rect"/>
                   </pic:spPr>
@@ -5860,7 +6077,40 @@
           <w:sz w:val="18"/>
           <w:szCs w:val="18"/>
         </w:rPr>
-        <w:t xml:space="preserve">Figure 9: Case report (top part)</w:t>
+        <w:t xml:space="preserve">Figure 11: Case report with checklist status and experts</w:t>
+      </w:r>
+    </w:p>
+    <w:p>
+      <w:pPr>
+        <w:spacing w:before="60" w:after="100" w:line="276" w:lineRule="auto"/>
+        <w:ind w:left="-397" w:right="-680"/>
+      </w:pPr>
+      <w:r>
+        <w:rPr>
+          <w:b/>
+        </w:rPr>
+        <w:t xml:space="preserve">Default checklist (administrator):</w:t>
+      </w:r>
+      <w:r>
+        <w:t xml:space="preserve"> under </w:t>
+      </w:r>
+      <w:r>
+        <w:rPr>
+          <w:b/>
+        </w:rPr>
+        <w:t xml:space="preserve">Data → Settings</w:t>
+      </w:r>
+      <w:r>
+        <w:t xml:space="preserve"> the list of steps every new case starts with can be edited, one step per line. Cases that already exist keep their steps; </w:t>
+      </w:r>
+      <w:r>
+        <w:rPr>
+          <w:b/>
+        </w:rPr>
+        <w:t xml:space="preserve">Add missing steps to open cases</w:t>
+      </w:r>
+      <w:r>
+        <w:t xml:space="preserve"> adds the steps of the list that an open case does not have yet, each after the step that precedes it in the list. Existing steps and results are kept and closed cases are skipped.</w:t>
       </w:r>
     </w:p>
     <w:p>
@@ -6418,7 +6668,7 @@
                     <pic:cNvPicPr/>
                   </pic:nvPicPr>
                   <pic:blipFill>
-                    <a:blip r:embed="rId24"/>
+                    <a:blip r:embed="rId26"/>
                     <a:stretch>
                       <a:fillRect/>
                     </a:stretch>
@@ -6448,7 +6698,7 @@
           <w:sz w:val="18"/>
           <w:szCs w:val="18"/>
         </w:rPr>
-        <w:t xml:space="preserve">Figure 10: Detection rules</w:t>
+        <w:t xml:space="preserve">Figure 12: Detection rules</w:t>
       </w:r>
     </w:p>
     <w:p>
@@ -6552,7 +6802,7 @@
                     <pic:cNvPicPr/>
                   </pic:nvPicPr>
                   <pic:blipFill>
-                    <a:blip r:embed="rId25"/>
+                    <a:blip r:embed="rId27"/>
                     <a:stretch>
                       <a:fillRect/>
                     </a:stretch>
@@ -6582,7 +6832,7 @@
           <w:sz w:val="18"/>
           <w:szCs w:val="18"/>
         </w:rPr>
-        <w:t xml:space="preserve">Figure 11: Suppression rules on the Detections page</w:t>
+        <w:t xml:space="preserve">Figure 13: Suppression rules on the Detections page</w:t>
       </w:r>
     </w:p>
     <w:p>
@@ -6811,7 +7061,7 @@
                     <pic:cNvPicPr/>
                   </pic:nvPicPr>
                   <pic:blipFill>
-                    <a:blip r:embed="rId26"/>
+                    <a:blip r:embed="rId28"/>
                     <a:stretch>
                       <a:fillRect/>
                     </a:stretch>
@@ -6841,7 +7091,7 @@
           <w:sz w:val="18"/>
           <w:szCs w:val="18"/>
         </w:rPr>
-        <w:t xml:space="preserve">Figure 12: Setting up the authenticator app</w:t>
+        <w:t xml:space="preserve">Figure 14: Setting up the authenticator app</w:t>
       </w:r>
     </w:p>
     <w:p>
@@ -6867,7 +7117,7 @@
                     <pic:cNvPicPr/>
                   </pic:nvPicPr>
                   <pic:blipFill>
-                    <a:blip r:embed="rId27"/>
+                    <a:blip r:embed="rId29"/>
                     <a:stretch>
                       <a:fillRect/>
                     </a:stretch>
@@ -6897,7 +7147,7 @@
           <w:sz w:val="18"/>
           <w:szCs w:val="18"/>
         </w:rPr>
-        <w:t xml:space="preserve">Figure 13: Two-step sign-in with an authenticator app and a passkey</w:t>
+        <w:t xml:space="preserve">Figure 15: Two-step sign-in with an authenticator app and a passkey</w:t>
       </w:r>
     </w:p>
     <w:p>
@@ -6956,7 +7206,7 @@
                     <pic:cNvPicPr/>
                   </pic:nvPicPr>
                   <pic:blipFill>
-                    <a:blip r:embed="rId28"/>
+                    <a:blip r:embed="rId30"/>
                     <a:stretch>
                       <a:fillRect/>
                     </a:stretch>
@@ -6986,7 +7236,7 @@
           <w:sz w:val="18"/>
           <w:szCs w:val="18"/>
         </w:rPr>
-        <w:t xml:space="preserve">Figure 14: Second step of the sign-in</w:t>
+        <w:t xml:space="preserve">Figure 16: Second step of the sign-in</w:t>
       </w:r>
     </w:p>
     <w:p>
@@ -7203,7 +7453,7 @@
                     <pic:cNvPicPr/>
                   </pic:nvPicPr>
                   <pic:blipFill>
-                    <a:blip r:embed="rId29"/>
+                    <a:blip r:embed="rId31"/>
                     <a:stretch>
                       <a:fillRect/>
                     </a:stretch>
@@ -7233,7 +7483,7 @@
           <w:sz w:val="18"/>
           <w:szCs w:val="18"/>
         </w:rPr>
-        <w:t xml:space="preserve">Figure 15: Users page</w:t>
+        <w:t xml:space="preserve">Figure 17: Users page</w:t>
       </w:r>
     </w:p>
     <w:p>
@@ -7366,7 +7616,7 @@
                     <pic:cNvPicPr/>
                   </pic:nvPicPr>
                   <pic:blipFill>
-                    <a:blip r:embed="rId30"/>
+                    <a:blip r:embed="rId32"/>
                     <a:stretch>
                       <a:fillRect/>
                     </a:stretch>
@@ -7396,7 +7646,7 @@
           <w:sz w:val="18"/>
           <w:szCs w:val="18"/>
         </w:rPr>
-        <w:t xml:space="preserve">Figure 16: Audit log</w:t>
+        <w:t xml:space="preserve">Figure 18: Audit log</w:t>
       </w:r>
     </w:p>
     <w:p>
@@ -7792,7 +8042,7 @@
                           <pic:cNvPicPr/>
                         </pic:nvPicPr>
                         <pic:blipFill>
-                          <a:blip r:embed="rId31"/>
+                          <a:blip r:embed="rId33"/>
                           <a:stretch>
                             <a:fillRect/>
                           </a:stretch>
@@ -7974,7 +8224,7 @@
                           <pic:cNvPicPr/>
                         </pic:nvPicPr>
                         <pic:blipFill>
-                          <a:blip r:embed="rId32"/>
+                          <a:blip r:embed="rId34"/>
                           <a:stretch>
                             <a:fillRect/>
                           </a:stretch>
@@ -8164,7 +8414,7 @@
                           <pic:cNvPicPr/>
                         </pic:nvPicPr>
                         <pic:blipFill>
-                          <a:blip r:embed="rId33"/>
+                          <a:blip r:embed="rId35"/>
                           <a:stretch>
                             <a:fillRect/>
                           </a:stretch>
@@ -8353,7 +8603,7 @@
                           <pic:cNvPicPr/>
                         </pic:nvPicPr>
                         <pic:blipFill>
-                          <a:blip r:embed="rId34"/>
+                          <a:blip r:embed="rId36"/>
                           <a:stretch>
                             <a:fillRect/>
                           </a:stretch>
@@ -8536,7 +8786,7 @@
                           <pic:cNvPicPr/>
                         </pic:nvPicPr>
                         <pic:blipFill>
-                          <a:blip r:embed="rId35"/>
+                          <a:blip r:embed="rId37"/>
                           <a:stretch>
                             <a:fillRect/>
                           </a:stretch>

</xml_diff>

<commit_message>
Checklist: several experts per step; manual and screenshots updated (revision stays 001)
Co-Authored-By: Claude Sonnet 5.5 <noreply@anthropic.com>
Claude-Session: https://claude.ai/code/session_014FSgcx4We9RLg8PGCKePg8
</commit_message>
<xml_diff>
--- a/docs/CORP-P2-ENG-0164-Fleet IDS SIEM - User Manual.docx
+++ b/docs/CORP-P2-ENG-0164-Fleet IDS SIEM - User Manual.docx
@@ -5681,16 +5681,16 @@
       <w:r>
         <w:t xml:space="preserve">7.</w:t>
         <w:tab/>
-        <w:t xml:space="preserve">To tie an expert to a step, choose the expert in the </w:t>
+        <w:t xml:space="preserve">To tie experts to a step, choose them in the field under the step (</w:t>
       </w:r>
       <w:r>
         <w:rPr>
           <w:b/>
         </w:rPr>
-        <w:t xml:space="preserve">Expert</w:t>
-      </w:r>
-      <w:r>
-        <w:t xml:space="preserve"> field under the step, or </w:t>
+        <w:t xml:space="preserve">Asked</w:t>
+      </w:r>
+      <w:r>
+        <w:t xml:space="preserve">), one after the other if you ask several people, or choose </w:t>
       </w:r>
       <w:r>
         <w:rPr>
@@ -5699,7 +5699,7 @@
         <w:t xml:space="preserve">New expert...</w:t>
       </w:r>
       <w:r>
-        <w:t xml:space="preserve"> to add one on the spot. The experts are listed in the case report, next to the steps they belong to.</w:t>
+        <w:t xml:space="preserve"> to add one on the spot. Each expert shows as a chip; the × removes the expert from that step again. The experts are listed in the case report, next to the steps they belong to.</w:t>
       </w:r>
     </w:p>
     <w:p>
@@ -5956,7 +5956,7 @@
           <w:sz w:val="18"/>
           <w:szCs w:val="18"/>
         </w:rPr>
-        <w:t xml:space="preserve">Figure 9: Checklist with status and expert per step</w:t>
+        <w:t xml:space="preserve">Figure 9: Checklist with status and experts per step</w:t>
       </w:r>
     </w:p>
     <w:p>

</xml_diff>

<commit_message>
Experts: persistent list of known experts, proposals while typing; manual updated (revision stays 001)
Co-Authored-By: Claude Sonnet 5.5 <noreply@anthropic.com>
Claude-Session: https://claude.ai/code/session_014FSgcx4We9RLg8PGCKePg8
</commit_message>
<xml_diff>
--- a/docs/CORP-P2-ENG-0164-Fleet IDS SIEM - User Manual.docx
+++ b/docs/CORP-P2-ENG-0164-Fleet IDS SIEM - User Manual.docx
@@ -932,7 +932,7 @@
                 <w:rStyle w:val="Hyperlink"/>
                 <w:noProof/>
               </w:rPr>
-              <w:t xml:space="preserve">14</w:t>
+              <w:t xml:space="preserve">15</w:t>
             </w:r>
           </w:hyperlink>
         </w:p>
@@ -974,7 +974,7 @@
                 <w:rStyle w:val="Hyperlink"/>
                 <w:noProof/>
               </w:rPr>
-              <w:t xml:space="preserve">16</w:t>
+              <w:t xml:space="preserve">17</w:t>
             </w:r>
           </w:hyperlink>
         </w:p>
@@ -1016,7 +1016,7 @@
                 <w:rStyle w:val="Hyperlink"/>
                 <w:noProof/>
               </w:rPr>
-              <w:t xml:space="preserve">18</w:t>
+              <w:t xml:space="preserve">19</w:t>
             </w:r>
           </w:hyperlink>
         </w:p>
@@ -1058,7 +1058,7 @@
                 <w:rStyle w:val="Hyperlink"/>
                 <w:noProof/>
               </w:rPr>
-              <w:t xml:space="preserve">19</w:t>
+              <w:t xml:space="preserve">20</w:t>
             </w:r>
           </w:hyperlink>
         </w:p>
@@ -1100,7 +1100,7 @@
                 <w:rStyle w:val="Hyperlink"/>
                 <w:noProof/>
               </w:rPr>
-              <w:t xml:space="preserve">20</w:t>
+              <w:t xml:space="preserve">21</w:t>
             </w:r>
           </w:hyperlink>
         </w:p>
@@ -1142,7 +1142,7 @@
                 <w:rStyle w:val="Hyperlink"/>
                 <w:noProof/>
               </w:rPr>
-              <w:t xml:space="preserve">21</w:t>
+              <w:t xml:space="preserve">22</w:t>
             </w:r>
           </w:hyperlink>
         </w:p>
@@ -1184,7 +1184,7 @@
                 <w:rStyle w:val="Hyperlink"/>
                 <w:noProof/>
               </w:rPr>
-              <w:t xml:space="preserve">21</w:t>
+              <w:t xml:space="preserve">22</w:t>
             </w:r>
           </w:hyperlink>
         </w:p>
@@ -1226,7 +1226,7 @@
                 <w:rStyle w:val="Hyperlink"/>
                 <w:noProof/>
               </w:rPr>
-              <w:t xml:space="preserve">22</w:t>
+              <w:t xml:space="preserve">23</w:t>
             </w:r>
           </w:hyperlink>
         </w:p>
@@ -1268,7 +1268,7 @@
                 <w:rStyle w:val="Hyperlink"/>
                 <w:noProof/>
               </w:rPr>
-              <w:t xml:space="preserve">22</w:t>
+              <w:t xml:space="preserve">23</w:t>
             </w:r>
           </w:hyperlink>
           <w:r>
@@ -5670,7 +5670,7 @@
         <w:t xml:space="preserve">Add expert</w:t>
       </w:r>
       <w:r>
-        <w:t xml:space="preserve"> and enter name, organisation or team, system or component, contact, the date and what the expert said. Names used in any case are proposed while you type and fill in organisation, system or component and contact when those fields are empty. Entries can be edited and removed.</w:t>
+        <w:t xml:space="preserve"> and enter name, organisation or team, system or component, contact, the date and what the expert said. Experts are remembered in a list that outlives the cases: as soon as you start typing a name, matching experts are proposed (name, organisation or system); choose one with the mouse or the arrow keys and Enter and the empty fields are filled in. The × in a proposal removes the name from the list. Entries can be edited and removed.</w:t>
       </w:r>
     </w:p>
     <w:p>

</xml_diff>

<commit_message>
Backup and restore: UI on the Data page, API, command line; manual updated (revision stays 001)
Co-Authored-By: Claude Sonnet 5.5 <noreply@anthropic.com>
Claude-Session: https://claude.ai/code/session_014FSgcx4We9RLg8PGCKePg8
</commit_message>
<xml_diff>
--- a/docs/CORP-P2-ENG-0164-Fleet IDS SIEM - User Manual.docx
+++ b/docs/CORP-P2-ENG-0164-Fleet IDS SIEM - User Manual.docx
@@ -1184,7 +1184,7 @@
                 <w:rStyle w:val="Hyperlink"/>
                 <w:noProof/>
               </w:rPr>
-              <w:t xml:space="preserve">22</w:t>
+              <w:t xml:space="preserve">23</w:t>
             </w:r>
           </w:hyperlink>
         </w:p>
@@ -7708,7 +7708,7 @@
         <w:t xml:space="preserve">data/siem.db</w:t>
       </w:r>
       <w:r>
-        <w:t xml:space="preserve">. Stop the tool and copy that file to back it up. Set the variable IDS_SIEM_DB to use another location.</w:t>
+        <w:t xml:space="preserve">. Set the variable IDS_SIEM_DB to use another location.</w:t>
       </w:r>
     </w:p>
     <w:p>
@@ -7724,10 +7724,171 @@
         <w:rPr>
           <w:b/>
         </w:rPr>
+        <w:t xml:space="preserve">Data → Backup and restore</w:t>
+      </w:r>
+      <w:r>
+        <w:t xml:space="preserve"> (administrator): choose </w:t>
+      </w:r>
+      <w:r>
+        <w:rPr>
+          <w:b/>
+        </w:rPr>
+        <w:t xml:space="preserve">Create backup now</w:t>
+      </w:r>
+      <w:r>
+        <w:t xml:space="preserve"> for a consistent copy of the whole database (events, alerts, cases, experts, settings, users and the audit log). It can be made while the tool is running. Backups are kept in </w:t>
+      </w:r>
+      <w:r>
+        <w:rPr>
+          <w:b/>
+        </w:rPr>
+        <w:t xml:space="preserve">data/backups</w:t>
+      </w:r>
+      <w:r>
+        <w:t xml:space="preserve"> and listed with size and time; each can be downloaded, restored or deleted.</w:t>
+      </w:r>
+    </w:p>
+    <w:p>
+      <w:pPr>
+        <w:spacing w:before="0" w:after="40" w:line="276" w:lineRule="auto"/>
+        <w:ind w:left="-37" w:right="-680" w:hanging="360"/>
+      </w:pPr>
+      <w:r>
+        <w:t xml:space="preserve">•</w:t>
+        <w:tab/>
+      </w:r>
+      <w:r>
+        <w:rPr>
+          <w:b/>
+        </w:rPr>
+        <w:t xml:space="preserve">Restore</w:t>
+      </w:r>
+      <w:r>
+        <w:t xml:space="preserve"> replaces everything with the chosen backup, or with a file you pick under </w:t>
+      </w:r>
+      <w:r>
+        <w:rPr>
+          <w:b/>
+        </w:rPr>
+        <w:t xml:space="preserve">Restore from a file...</w:t>
+      </w:r>
+      <w:r>
+        <w:t xml:space="preserve">. The file is checked first. The current state is saved as a *before-restore* backup, so a restore can be undone. Type RESTORE to confirm. Everybody has to sign in again afterwards.</w:t>
+      </w:r>
+    </w:p>
+    <w:p>
+      <w:pPr>
+        <w:spacing w:before="0" w:after="40" w:line="276" w:lineRule="auto"/>
+        <w:ind w:left="-37" w:right="-680" w:hanging="360"/>
+      </w:pPr>
+      <w:r>
+        <w:t xml:space="preserve">•</w:t>
+        <w:tab/>
+        <w:t xml:space="preserve">On the command line: </w:t>
+      </w:r>
+      <w:r>
+        <w:rPr>
+          <w:b/>
+        </w:rPr>
+        <w:t xml:space="preserve">python idssiem.py --backup</w:t>
+      </w:r>
+      <w:r>
+        <w:t xml:space="preserve"> and </w:t>
+      </w:r>
+      <w:r>
+        <w:rPr>
+          <w:b/>
+        </w:rPr>
+        <w:t xml:space="preserve">python idssiem.py --restore FILE</w:t>
+      </w:r>
+      <w:r>
+        <w:t xml:space="preserve"> (stop the server first).</w:t>
+      </w:r>
+    </w:p>
+    <w:p>
+      <w:pPr>
+        <w:spacing w:before="0" w:after="40" w:line="276" w:lineRule="auto"/>
+        <w:ind w:left="-37" w:right="-680" w:hanging="360"/>
+      </w:pPr>
+      <w:r>
+        <w:t xml:space="preserve">•</w:t>
+        <w:tab/>
+        <w:t xml:space="preserve">Backup files contain password hashes, API tokens and authenticator secrets. Store and share them like the database itself.</w:t>
+      </w:r>
+    </w:p>
+    <w:p>
+      <w:pPr>
+        <w:spacing w:before="0" w:after="40" w:line="276" w:lineRule="auto"/>
+        <w:ind w:left="-37" w:right="-680" w:hanging="360"/>
+      </w:pPr>
+      <w:r>
+        <w:t xml:space="preserve">•</w:t>
+        <w:tab/>
+      </w:r>
+      <w:r>
+        <w:rPr>
+          <w:b/>
+        </w:rPr>
         <w:t xml:space="preserve">Data → Delete everything</w:t>
       </w:r>
       <w:r>
         <w:t xml:space="preserve"> (administrator) removes all events, alerts, cases and notes after you type the confirmation. Catalog, settings and the audit log stay.</w:t>
+      </w:r>
+    </w:p>
+    <w:p>
+      <w:pPr>
+        <w:keepNext/>
+        <w:spacing w:before="80" w:after="40"/>
+        <w:spacing w:line="276" w:lineRule="auto"/>
+        <w:ind w:left="-397" w:right="-680"/>
+      </w:pPr>
+      <w:r>
+        <w:drawing>
+          <wp:inline xmlns:a="http://schemas.openxmlformats.org/drawingml/2006/main" xmlns:pic="http://schemas.openxmlformats.org/drawingml/2006/picture">
+            <wp:extent cx="5120640" cy="1776032"/>
+            <wp:docPr id="1" name="Picture 1"/>
+            <wp:cNvGraphicFramePr>
+              <a:graphicFrameLocks noChangeAspect="1"/>
+            </wp:cNvGraphicFramePr>
+            <a:graphic>
+              <a:graphicData uri="http://schemas.openxmlformats.org/drawingml/2006/picture">
+                <pic:pic>
+                  <pic:nvPicPr>
+                    <pic:cNvPr id="0" name="18_backup.png"/>
+                    <pic:cNvPicPr/>
+                  </pic:nvPicPr>
+                  <pic:blipFill>
+                    <a:blip r:embed="rId33"/>
+                    <a:stretch>
+                      <a:fillRect/>
+                    </a:stretch>
+                  </pic:blipFill>
+                  <pic:spPr>
+                    <a:xfrm>
+                      <a:off x="0" y="0"/>
+                      <a:ext cx="5120640" cy="1776032"/>
+                    </a:xfrm>
+                    <a:prstGeom prst="rect"/>
+                  </pic:spPr>
+                </pic:pic>
+              </a:graphicData>
+            </a:graphic>
+          </wp:inline>
+        </w:drawing>
+      </w:r>
+    </w:p>
+    <w:p>
+      <w:pPr>
+        <w:spacing w:before="0" w:after="140" w:line="276" w:lineRule="auto"/>
+        <w:ind w:left="-397" w:right="-680"/>
+      </w:pPr>
+      <w:r>
+        <w:rPr>
+          <w:i/>
+          <w:sz w:val="18"/>
+          <w:szCs w:val="18"/>
+        </w:rPr>
+        <w:t xml:space="preserve">Figure 19: Backup and restore on the Data page</w:t>
       </w:r>
     </w:p>
     <w:p>
@@ -8042,7 +8203,7 @@
                           <pic:cNvPicPr/>
                         </pic:nvPicPr>
                         <pic:blipFill>
-                          <a:blip r:embed="rId33"/>
+                          <a:blip r:embed="rId34"/>
                           <a:stretch>
                             <a:fillRect/>
                           </a:stretch>
@@ -8224,7 +8385,7 @@
                           <pic:cNvPicPr/>
                         </pic:nvPicPr>
                         <pic:blipFill>
-                          <a:blip r:embed="rId34"/>
+                          <a:blip r:embed="rId35"/>
                           <a:stretch>
                             <a:fillRect/>
                           </a:stretch>
@@ -8414,7 +8575,7 @@
                           <pic:cNvPicPr/>
                         </pic:nvPicPr>
                         <pic:blipFill>
-                          <a:blip r:embed="rId35"/>
+                          <a:blip r:embed="rId36"/>
                           <a:stretch>
                             <a:fillRect/>
                           </a:stretch>
@@ -8603,7 +8764,7 @@
                           <pic:cNvPicPr/>
                         </pic:nvPicPr>
                         <pic:blipFill>
-                          <a:blip r:embed="rId36"/>
+                          <a:blip r:embed="rId37"/>
                           <a:stretch>
                             <a:fillRect/>
                           </a:stretch>
@@ -8786,7 +8947,7 @@
                           <pic:cNvPicPr/>
                         </pic:nvPicPr>
                         <pic:blipFill>
-                          <a:blip r:embed="rId37"/>
+                          <a:blip r:embed="rId38"/>
                           <a:stretch>
                             <a:fillRect/>
                           </a:stretch>

</xml_diff>